<commit_message>
Point the documentation at the workflow's actual location
Four places named .github/workflows/desktop-release.yml, which is not where the
file is any more: the two build scripts' headers, the desktop README, and the
documentation's repository layout and desktop sections. All of them now say
desktop/ci/, and the documentation explains why it is parked there rather than
leaving a reader to wonder why a workflow in the repository never runs.

Co-Authored-By: Claude Opus 5 <noreply@anthropic.com>
Claude-Session: https://claude.ai/code/session_01BuVGzrmdiZ5dZpF1oBf9X2
</commit_message>
<xml_diff>
--- a/docs/mCollaborator Extensive Documentation.docx
+++ b/docs/mCollaborator Extensive Documentation.docx
@@ -194,7 +194,7 @@
           <w:r>
             <w:fldChar w:fldCharType="separate"/>
           </w:r>
-          <w:hyperlink w:anchor="_Toc238982497" w:history="1">
+          <w:hyperlink w:anchor="_Toc238986127" w:history="1">
             <w:r>
               <w:rPr>
                 <w:rStyle w:val="Hyperlink"/>
@@ -237,7 +237,7 @@
                 <w:noProof/>
                 <w:webHidden/>
               </w:rPr>
-              <w:instrText xml:space="preserve"> PAGEREF _Toc238982497 \h </w:instrText>
+              <w:instrText xml:space="preserve"> PAGEREF _Toc238986127 \h </w:instrText>
             </w:r>
             <w:r>
               <w:rPr>
@@ -280,7 +280,7 @@
               <w:sz w:val="24"/>
             </w:rPr>
           </w:pPr>
-          <w:hyperlink w:anchor="_Toc238982498" w:history="1">
+          <w:hyperlink w:anchor="_Toc238986128" w:history="1">
             <w:r>
               <w:rPr>
                 <w:rStyle w:val="Hyperlink"/>
@@ -308,7 +308,7 @@
                 <w:noProof/>
                 <w:webHidden/>
               </w:rPr>
-              <w:instrText xml:space="preserve"> PAGEREF _Toc238982498 \h </w:instrText>
+              <w:instrText xml:space="preserve"> PAGEREF _Toc238986128 \h </w:instrText>
             </w:r>
             <w:r>
               <w:rPr>
@@ -351,7 +351,7 @@
               <w:sz w:val="24"/>
             </w:rPr>
           </w:pPr>
-          <w:hyperlink w:anchor="_Toc238982499" w:history="1">
+          <w:hyperlink w:anchor="_Toc238986129" w:history="1">
             <w:r>
               <w:rPr>
                 <w:rStyle w:val="Hyperlink"/>
@@ -379,7 +379,7 @@
                 <w:noProof/>
                 <w:webHidden/>
               </w:rPr>
-              <w:instrText xml:space="preserve"> PAGEREF _Toc238982499 \h </w:instrText>
+              <w:instrText xml:space="preserve"> PAGEREF _Toc238986129 \h </w:instrText>
             </w:r>
             <w:r>
               <w:rPr>
@@ -422,7 +422,7 @@
               <w:sz w:val="24"/>
             </w:rPr>
           </w:pPr>
-          <w:hyperlink w:anchor="_Toc238982500" w:history="1">
+          <w:hyperlink w:anchor="_Toc238986130" w:history="1">
             <w:r>
               <w:rPr>
                 <w:rStyle w:val="Hyperlink"/>
@@ -450,7 +450,7 @@
                 <w:noProof/>
                 <w:webHidden/>
               </w:rPr>
-              <w:instrText xml:space="preserve"> PAGEREF _Toc238982500 \h </w:instrText>
+              <w:instrText xml:space="preserve"> PAGEREF _Toc238986130 \h </w:instrText>
             </w:r>
             <w:r>
               <w:rPr>
@@ -494,7 +494,7 @@
               <w:sz w:val="24"/>
             </w:rPr>
           </w:pPr>
-          <w:hyperlink w:anchor="_Toc238982501" w:history="1">
+          <w:hyperlink w:anchor="_Toc238986131" w:history="1">
             <w:r>
               <w:rPr>
                 <w:rStyle w:val="Hyperlink"/>
@@ -537,7 +537,7 @@
                 <w:noProof/>
                 <w:webHidden/>
               </w:rPr>
-              <w:instrText xml:space="preserve"> PAGEREF _Toc238982501 \h </w:instrText>
+              <w:instrText xml:space="preserve"> PAGEREF _Toc238986131 \h </w:instrText>
             </w:r>
             <w:r>
               <w:rPr>
@@ -580,7 +580,7 @@
               <w:sz w:val="24"/>
             </w:rPr>
           </w:pPr>
-          <w:hyperlink w:anchor="_Toc238982502" w:history="1">
+          <w:hyperlink w:anchor="_Toc238986132" w:history="1">
             <w:r>
               <w:rPr>
                 <w:rStyle w:val="Hyperlink"/>
@@ -608,7 +608,7 @@
                 <w:noProof/>
                 <w:webHidden/>
               </w:rPr>
-              <w:instrText xml:space="preserve"> PAGEREF _Toc238982502 \h </w:instrText>
+              <w:instrText xml:space="preserve"> PAGEREF _Toc238986132 \h </w:instrText>
             </w:r>
             <w:r>
               <w:rPr>
@@ -651,7 +651,7 @@
               <w:sz w:val="24"/>
             </w:rPr>
           </w:pPr>
-          <w:hyperlink w:anchor="_Toc238982503" w:history="1">
+          <w:hyperlink w:anchor="_Toc238986133" w:history="1">
             <w:r>
               <w:rPr>
                 <w:rStyle w:val="Hyperlink"/>
@@ -679,7 +679,7 @@
                 <w:noProof/>
                 <w:webHidden/>
               </w:rPr>
-              <w:instrText xml:space="preserve"> PAGEREF _Toc238982503 \h </w:instrText>
+              <w:instrText xml:space="preserve"> PAGEREF _Toc238986133 \h </w:instrText>
             </w:r>
             <w:r>
               <w:rPr>
@@ -722,7 +722,7 @@
               <w:sz w:val="24"/>
             </w:rPr>
           </w:pPr>
-          <w:hyperlink w:anchor="_Toc238982504" w:history="1">
+          <w:hyperlink w:anchor="_Toc238986134" w:history="1">
             <w:r>
               <w:rPr>
                 <w:rStyle w:val="Hyperlink"/>
@@ -750,7 +750,7 @@
                 <w:noProof/>
                 <w:webHidden/>
               </w:rPr>
-              <w:instrText xml:space="preserve"> PAGEREF _Toc238982504 \h </w:instrText>
+              <w:instrText xml:space="preserve"> PAGEREF _Toc238986134 \h </w:instrText>
             </w:r>
             <w:r>
               <w:rPr>
@@ -793,7 +793,7 @@
               <w:sz w:val="24"/>
             </w:rPr>
           </w:pPr>
-          <w:hyperlink w:anchor="_Toc238982505" w:history="1">
+          <w:hyperlink w:anchor="_Toc238986135" w:history="1">
             <w:r>
               <w:rPr>
                 <w:rStyle w:val="Hyperlink"/>
@@ -821,7 +821,7 @@
                 <w:noProof/>
                 <w:webHidden/>
               </w:rPr>
-              <w:instrText xml:space="preserve"> PAGEREF _Toc238982505 \h </w:instrText>
+              <w:instrText xml:space="preserve"> PAGEREF _Toc238986135 \h </w:instrText>
             </w:r>
             <w:r>
               <w:rPr>
@@ -865,7 +865,7 @@
               <w:sz w:val="24"/>
             </w:rPr>
           </w:pPr>
-          <w:hyperlink w:anchor="_Toc238982506" w:history="1">
+          <w:hyperlink w:anchor="_Toc238986136" w:history="1">
             <w:r>
               <w:rPr>
                 <w:rStyle w:val="Hyperlink"/>
@@ -908,7 +908,7 @@
                 <w:noProof/>
                 <w:webHidden/>
               </w:rPr>
-              <w:instrText xml:space="preserve"> PAGEREF _Toc238982506 \h </w:instrText>
+              <w:instrText xml:space="preserve"> PAGEREF _Toc238986136 \h </w:instrText>
             </w:r>
             <w:r>
               <w:rPr>
@@ -951,7 +951,7 @@
               <w:sz w:val="24"/>
             </w:rPr>
           </w:pPr>
-          <w:hyperlink w:anchor="_Toc238982507" w:history="1">
+          <w:hyperlink w:anchor="_Toc238986137" w:history="1">
             <w:r>
               <w:rPr>
                 <w:rStyle w:val="Hyperlink"/>
@@ -979,7 +979,7 @@
                 <w:noProof/>
                 <w:webHidden/>
               </w:rPr>
-              <w:instrText xml:space="preserve"> PAGEREF _Toc238982507 \h </w:instrText>
+              <w:instrText xml:space="preserve"> PAGEREF _Toc238986137 \h </w:instrText>
             </w:r>
             <w:r>
               <w:rPr>
@@ -1022,7 +1022,7 @@
               <w:sz w:val="24"/>
             </w:rPr>
           </w:pPr>
-          <w:hyperlink w:anchor="_Toc238982508" w:history="1">
+          <w:hyperlink w:anchor="_Toc238986138" w:history="1">
             <w:r>
               <w:rPr>
                 <w:rStyle w:val="Hyperlink"/>
@@ -1050,7 +1050,7 @@
                 <w:noProof/>
                 <w:webHidden/>
               </w:rPr>
-              <w:instrText xml:space="preserve"> PAGEREF _Toc238982508 \h </w:instrText>
+              <w:instrText xml:space="preserve"> PAGEREF _Toc238986138 \h </w:instrText>
             </w:r>
             <w:r>
               <w:rPr>
@@ -1094,7 +1094,7 @@
               <w:sz w:val="24"/>
             </w:rPr>
           </w:pPr>
-          <w:hyperlink w:anchor="_Toc238982509" w:history="1">
+          <w:hyperlink w:anchor="_Toc238986139" w:history="1">
             <w:r>
               <w:rPr>
                 <w:rStyle w:val="Hyperlink"/>
@@ -1137,7 +1137,7 @@
                 <w:noProof/>
                 <w:webHidden/>
               </w:rPr>
-              <w:instrText xml:space="preserve"> PAGEREF _Toc238982509 \h </w:instrText>
+              <w:instrText xml:space="preserve"> PAGEREF _Toc238986139 \h </w:instrText>
             </w:r>
             <w:r>
               <w:rPr>
@@ -1180,7 +1180,7 @@
               <w:sz w:val="24"/>
             </w:rPr>
           </w:pPr>
-          <w:hyperlink w:anchor="_Toc238982510" w:history="1">
+          <w:hyperlink w:anchor="_Toc238986140" w:history="1">
             <w:r>
               <w:rPr>
                 <w:rStyle w:val="Hyperlink"/>
@@ -1208,7 +1208,7 @@
                 <w:noProof/>
                 <w:webHidden/>
               </w:rPr>
-              <w:instrText xml:space="preserve"> PAGEREF _Toc238982510 \h </w:instrText>
+              <w:instrText xml:space="preserve"> PAGEREF _Toc238986140 \h </w:instrText>
             </w:r>
             <w:r>
               <w:rPr>
@@ -1251,7 +1251,7 @@
               <w:sz w:val="24"/>
             </w:rPr>
           </w:pPr>
-          <w:hyperlink w:anchor="_Toc238982511" w:history="1">
+          <w:hyperlink w:anchor="_Toc238986141" w:history="1">
             <w:r>
               <w:rPr>
                 <w:rStyle w:val="Hyperlink"/>
@@ -1279,7 +1279,7 @@
                 <w:noProof/>
                 <w:webHidden/>
               </w:rPr>
-              <w:instrText xml:space="preserve"> PAGEREF _Toc238982511 \h </w:instrText>
+              <w:instrText xml:space="preserve"> PAGEREF _Toc238986141 \h </w:instrText>
             </w:r>
             <w:r>
               <w:rPr>
@@ -1322,7 +1322,7 @@
               <w:sz w:val="24"/>
             </w:rPr>
           </w:pPr>
-          <w:hyperlink w:anchor="_Toc238982512" w:history="1">
+          <w:hyperlink w:anchor="_Toc238986142" w:history="1">
             <w:r>
               <w:rPr>
                 <w:rStyle w:val="Hyperlink"/>
@@ -1350,7 +1350,7 @@
                 <w:noProof/>
                 <w:webHidden/>
               </w:rPr>
-              <w:instrText xml:space="preserve"> PAGEREF _Toc238982512 \h </w:instrText>
+              <w:instrText xml:space="preserve"> PAGEREF _Toc238986142 \h </w:instrText>
             </w:r>
             <w:r>
               <w:rPr>
@@ -1393,7 +1393,7 @@
               <w:sz w:val="24"/>
             </w:rPr>
           </w:pPr>
-          <w:hyperlink w:anchor="_Toc238982513" w:history="1">
+          <w:hyperlink w:anchor="_Toc238986143" w:history="1">
             <w:r>
               <w:rPr>
                 <w:rStyle w:val="Hyperlink"/>
@@ -1421,7 +1421,7 @@
                 <w:noProof/>
                 <w:webHidden/>
               </w:rPr>
-              <w:instrText xml:space="preserve"> PAGEREF _Toc238982513 \h </w:instrText>
+              <w:instrText xml:space="preserve"> PAGEREF _Toc238986143 \h </w:instrText>
             </w:r>
             <w:r>
               <w:rPr>
@@ -1464,7 +1464,7 @@
               <w:sz w:val="24"/>
             </w:rPr>
           </w:pPr>
-          <w:hyperlink w:anchor="_Toc238982514" w:history="1">
+          <w:hyperlink w:anchor="_Toc238986144" w:history="1">
             <w:r>
               <w:rPr>
                 <w:rStyle w:val="Hyperlink"/>
@@ -1492,7 +1492,7 @@
                 <w:noProof/>
                 <w:webHidden/>
               </w:rPr>
-              <w:instrText xml:space="preserve"> PAGEREF _Toc238982514 \h </w:instrText>
+              <w:instrText xml:space="preserve"> PAGEREF _Toc238986144 \h </w:instrText>
             </w:r>
             <w:r>
               <w:rPr>
@@ -1536,7 +1536,7 @@
               <w:sz w:val="24"/>
             </w:rPr>
           </w:pPr>
-          <w:hyperlink w:anchor="_Toc238982515" w:history="1">
+          <w:hyperlink w:anchor="_Toc238986145" w:history="1">
             <w:r>
               <w:rPr>
                 <w:rStyle w:val="Hyperlink"/>
@@ -1579,7 +1579,7 @@
                 <w:noProof/>
                 <w:webHidden/>
               </w:rPr>
-              <w:instrText xml:space="preserve"> PAGEREF _Toc238982515 \h </w:instrText>
+              <w:instrText xml:space="preserve"> PAGEREF _Toc238986145 \h </w:instrText>
             </w:r>
             <w:r>
               <w:rPr>
@@ -1622,7 +1622,7 @@
               <w:sz w:val="24"/>
             </w:rPr>
           </w:pPr>
-          <w:hyperlink w:anchor="_Toc238982516" w:history="1">
+          <w:hyperlink w:anchor="_Toc238986146" w:history="1">
             <w:r>
               <w:rPr>
                 <w:rStyle w:val="Hyperlink"/>
@@ -1650,7 +1650,7 @@
                 <w:noProof/>
                 <w:webHidden/>
               </w:rPr>
-              <w:instrText xml:space="preserve"> PAGEREF _Toc238982516 \h </w:instrText>
+              <w:instrText xml:space="preserve"> PAGEREF _Toc238986146 \h </w:instrText>
             </w:r>
             <w:r>
               <w:rPr>
@@ -1693,7 +1693,7 @@
               <w:sz w:val="24"/>
             </w:rPr>
           </w:pPr>
-          <w:hyperlink w:anchor="_Toc238982517" w:history="1">
+          <w:hyperlink w:anchor="_Toc238986147" w:history="1">
             <w:r>
               <w:rPr>
                 <w:rStyle w:val="Hyperlink"/>
@@ -1721,7 +1721,7 @@
                 <w:noProof/>
                 <w:webHidden/>
               </w:rPr>
-              <w:instrText xml:space="preserve"> PAGEREF _Toc238982517 \h </w:instrText>
+              <w:instrText xml:space="preserve"> PAGEREF _Toc238986147 \h </w:instrText>
             </w:r>
             <w:r>
               <w:rPr>
@@ -1764,7 +1764,7 @@
               <w:sz w:val="24"/>
             </w:rPr>
           </w:pPr>
-          <w:hyperlink w:anchor="_Toc238982518" w:history="1">
+          <w:hyperlink w:anchor="_Toc238986148" w:history="1">
             <w:r>
               <w:rPr>
                 <w:rStyle w:val="Hyperlink"/>
@@ -1792,7 +1792,7 @@
                 <w:noProof/>
                 <w:webHidden/>
               </w:rPr>
-              <w:instrText xml:space="preserve"> PAGEREF _Toc238982518 \h </w:instrText>
+              <w:instrText xml:space="preserve"> PAGEREF _Toc238986148 \h </w:instrText>
             </w:r>
             <w:r>
               <w:rPr>
@@ -1835,7 +1835,7 @@
               <w:sz w:val="24"/>
             </w:rPr>
           </w:pPr>
-          <w:hyperlink w:anchor="_Toc238982519" w:history="1">
+          <w:hyperlink w:anchor="_Toc238986149" w:history="1">
             <w:r>
               <w:rPr>
                 <w:rStyle w:val="Hyperlink"/>
@@ -1863,7 +1863,7 @@
                 <w:noProof/>
                 <w:webHidden/>
               </w:rPr>
-              <w:instrText xml:space="preserve"> PAGEREF _Toc238982519 \h </w:instrText>
+              <w:instrText xml:space="preserve"> PAGEREF _Toc238986149 \h </w:instrText>
             </w:r>
             <w:r>
               <w:rPr>
@@ -1906,7 +1906,7 @@
               <w:sz w:val="24"/>
             </w:rPr>
           </w:pPr>
-          <w:hyperlink w:anchor="_Toc238982520" w:history="1">
+          <w:hyperlink w:anchor="_Toc238986150" w:history="1">
             <w:r>
               <w:rPr>
                 <w:rStyle w:val="Hyperlink"/>
@@ -1934,7 +1934,7 @@
                 <w:noProof/>
                 <w:webHidden/>
               </w:rPr>
-              <w:instrText xml:space="preserve"> PAGEREF _Toc238982520 \h </w:instrText>
+              <w:instrText xml:space="preserve"> PAGEREF _Toc238986150 \h </w:instrText>
             </w:r>
             <w:r>
               <w:rPr>
@@ -1978,7 +1978,7 @@
               <w:sz w:val="24"/>
             </w:rPr>
           </w:pPr>
-          <w:hyperlink w:anchor="_Toc238982521" w:history="1">
+          <w:hyperlink w:anchor="_Toc238986151" w:history="1">
             <w:r>
               <w:rPr>
                 <w:rStyle w:val="Hyperlink"/>
@@ -2021,7 +2021,7 @@
                 <w:noProof/>
                 <w:webHidden/>
               </w:rPr>
-              <w:instrText xml:space="preserve"> PAGEREF _Toc238982521 \h </w:instrText>
+              <w:instrText xml:space="preserve"> PAGEREF _Toc238986151 \h </w:instrText>
             </w:r>
             <w:r>
               <w:rPr>
@@ -2064,7 +2064,7 @@
               <w:sz w:val="24"/>
             </w:rPr>
           </w:pPr>
-          <w:hyperlink w:anchor="_Toc238982522" w:history="1">
+          <w:hyperlink w:anchor="_Toc238986152" w:history="1">
             <w:r>
               <w:rPr>
                 <w:rStyle w:val="Hyperlink"/>
@@ -2092,7 +2092,7 @@
                 <w:noProof/>
                 <w:webHidden/>
               </w:rPr>
-              <w:instrText xml:space="preserve"> PAGEREF _Toc238982522 \h </w:instrText>
+              <w:instrText xml:space="preserve"> PAGEREF _Toc238986152 \h </w:instrText>
             </w:r>
             <w:r>
               <w:rPr>
@@ -2135,7 +2135,7 @@
               <w:sz w:val="24"/>
             </w:rPr>
           </w:pPr>
-          <w:hyperlink w:anchor="_Toc238982523" w:history="1">
+          <w:hyperlink w:anchor="_Toc238986153" w:history="1">
             <w:r>
               <w:rPr>
                 <w:rStyle w:val="Hyperlink"/>
@@ -2163,7 +2163,7 @@
                 <w:noProof/>
                 <w:webHidden/>
               </w:rPr>
-              <w:instrText xml:space="preserve"> PAGEREF _Toc238982523 \h </w:instrText>
+              <w:instrText xml:space="preserve"> PAGEREF _Toc238986153 \h </w:instrText>
             </w:r>
             <w:r>
               <w:rPr>
@@ -2206,7 +2206,7 @@
               <w:sz w:val="24"/>
             </w:rPr>
           </w:pPr>
-          <w:hyperlink w:anchor="_Toc238982524" w:history="1">
+          <w:hyperlink w:anchor="_Toc238986154" w:history="1">
             <w:r>
               <w:rPr>
                 <w:rStyle w:val="Hyperlink"/>
@@ -2234,7 +2234,7 @@
                 <w:noProof/>
                 <w:webHidden/>
               </w:rPr>
-              <w:instrText xml:space="preserve"> PAGEREF _Toc238982524 \h </w:instrText>
+              <w:instrText xml:space="preserve"> PAGEREF _Toc238986154 \h </w:instrText>
             </w:r>
             <w:r>
               <w:rPr>
@@ -2277,7 +2277,7 @@
               <w:sz w:val="24"/>
             </w:rPr>
           </w:pPr>
-          <w:hyperlink w:anchor="_Toc238982525" w:history="1">
+          <w:hyperlink w:anchor="_Toc238986155" w:history="1">
             <w:r>
               <w:rPr>
                 <w:rStyle w:val="Hyperlink"/>
@@ -2305,7 +2305,7 @@
                 <w:noProof/>
                 <w:webHidden/>
               </w:rPr>
-              <w:instrText xml:space="preserve"> PAGEREF _Toc238982525 \h </w:instrText>
+              <w:instrText xml:space="preserve"> PAGEREF _Toc238986155 \h </w:instrText>
             </w:r>
             <w:r>
               <w:rPr>
@@ -2349,7 +2349,7 @@
               <w:sz w:val="24"/>
             </w:rPr>
           </w:pPr>
-          <w:hyperlink w:anchor="_Toc238982526" w:history="1">
+          <w:hyperlink w:anchor="_Toc238986156" w:history="1">
             <w:r>
               <w:rPr>
                 <w:rStyle w:val="Hyperlink"/>
@@ -2392,7 +2392,7 @@
                 <w:noProof/>
                 <w:webHidden/>
               </w:rPr>
-              <w:instrText xml:space="preserve"> PAGEREF _Toc238982526 \h </w:instrText>
+              <w:instrText xml:space="preserve"> PAGEREF _Toc238986156 \h </w:instrText>
             </w:r>
             <w:r>
               <w:rPr>
@@ -2435,7 +2435,7 @@
               <w:sz w:val="24"/>
             </w:rPr>
           </w:pPr>
-          <w:hyperlink w:anchor="_Toc238982527" w:history="1">
+          <w:hyperlink w:anchor="_Toc238986157" w:history="1">
             <w:r>
               <w:rPr>
                 <w:rStyle w:val="Hyperlink"/>
@@ -2463,7 +2463,7 @@
                 <w:noProof/>
                 <w:webHidden/>
               </w:rPr>
-              <w:instrText xml:space="preserve"> PAGEREF _Toc238982527 \h </w:instrText>
+              <w:instrText xml:space="preserve"> PAGEREF _Toc238986157 \h </w:instrText>
             </w:r>
             <w:r>
               <w:rPr>
@@ -2506,7 +2506,7 @@
               <w:sz w:val="24"/>
             </w:rPr>
           </w:pPr>
-          <w:hyperlink w:anchor="_Toc238982528" w:history="1">
+          <w:hyperlink w:anchor="_Toc238986158" w:history="1">
             <w:r>
               <w:rPr>
                 <w:rStyle w:val="Hyperlink"/>
@@ -2534,7 +2534,7 @@
                 <w:noProof/>
                 <w:webHidden/>
               </w:rPr>
-              <w:instrText xml:space="preserve"> PAGEREF _Toc238982528 \h </w:instrText>
+              <w:instrText xml:space="preserve"> PAGEREF _Toc238986158 \h </w:instrText>
             </w:r>
             <w:r>
               <w:rPr>
@@ -2577,7 +2577,7 @@
               <w:sz w:val="24"/>
             </w:rPr>
           </w:pPr>
-          <w:hyperlink w:anchor="_Toc238982529" w:history="1">
+          <w:hyperlink w:anchor="_Toc238986159" w:history="1">
             <w:r>
               <w:rPr>
                 <w:rStyle w:val="Hyperlink"/>
@@ -2605,7 +2605,7 @@
                 <w:noProof/>
                 <w:webHidden/>
               </w:rPr>
-              <w:instrText xml:space="preserve"> PAGEREF _Toc238982529 \h </w:instrText>
+              <w:instrText xml:space="preserve"> PAGEREF _Toc238986159 \h </w:instrText>
             </w:r>
             <w:r>
               <w:rPr>
@@ -2649,7 +2649,7 @@
               <w:sz w:val="24"/>
             </w:rPr>
           </w:pPr>
-          <w:hyperlink w:anchor="_Toc238982530" w:history="1">
+          <w:hyperlink w:anchor="_Toc238986160" w:history="1">
             <w:r>
               <w:rPr>
                 <w:rStyle w:val="Hyperlink"/>
@@ -2692,7 +2692,7 @@
                 <w:noProof/>
                 <w:webHidden/>
               </w:rPr>
-              <w:instrText xml:space="preserve"> PAGEREF _Toc238982530 \h </w:instrText>
+              <w:instrText xml:space="preserve"> PAGEREF _Toc238986160 \h </w:instrText>
             </w:r>
             <w:r>
               <w:rPr>
@@ -2735,7 +2735,7 @@
               <w:sz w:val="24"/>
             </w:rPr>
           </w:pPr>
-          <w:hyperlink w:anchor="_Toc238982531" w:history="1">
+          <w:hyperlink w:anchor="_Toc238986161" w:history="1">
             <w:r>
               <w:rPr>
                 <w:rStyle w:val="Hyperlink"/>
@@ -2763,7 +2763,7 @@
                 <w:noProof/>
                 <w:webHidden/>
               </w:rPr>
-              <w:instrText xml:space="preserve"> PAGEREF _Toc238982531 \h </w:instrText>
+              <w:instrText xml:space="preserve"> PAGEREF _Toc238986161 \h </w:instrText>
             </w:r>
             <w:r>
               <w:rPr>
@@ -2806,7 +2806,7 @@
               <w:sz w:val="24"/>
             </w:rPr>
           </w:pPr>
-          <w:hyperlink w:anchor="_Toc238982532" w:history="1">
+          <w:hyperlink w:anchor="_Toc238986162" w:history="1">
             <w:r>
               <w:rPr>
                 <w:rStyle w:val="Hyperlink"/>
@@ -2834,7 +2834,7 @@
                 <w:noProof/>
                 <w:webHidden/>
               </w:rPr>
-              <w:instrText xml:space="preserve"> PAGEREF _Toc238982532 \h </w:instrText>
+              <w:instrText xml:space="preserve"> PAGEREF _Toc238986162 \h </w:instrText>
             </w:r>
             <w:r>
               <w:rPr>
@@ -2877,7 +2877,7 @@
               <w:sz w:val="24"/>
             </w:rPr>
           </w:pPr>
-          <w:hyperlink w:anchor="_Toc238982533" w:history="1">
+          <w:hyperlink w:anchor="_Toc238986163" w:history="1">
             <w:r>
               <w:rPr>
                 <w:rStyle w:val="Hyperlink"/>
@@ -2905,7 +2905,7 @@
                 <w:noProof/>
                 <w:webHidden/>
               </w:rPr>
-              <w:instrText xml:space="preserve"> PAGEREF _Toc238982533 \h </w:instrText>
+              <w:instrText xml:space="preserve"> PAGEREF _Toc238986163 \h </w:instrText>
             </w:r>
             <w:r>
               <w:rPr>
@@ -2948,7 +2948,7 @@
               <w:sz w:val="24"/>
             </w:rPr>
           </w:pPr>
-          <w:hyperlink w:anchor="_Toc238982534" w:history="1">
+          <w:hyperlink w:anchor="_Toc238986164" w:history="1">
             <w:r>
               <w:rPr>
                 <w:rStyle w:val="Hyperlink"/>
@@ -2976,7 +2976,7 @@
                 <w:noProof/>
                 <w:webHidden/>
               </w:rPr>
-              <w:instrText xml:space="preserve"> PAGEREF _Toc238982534 \h </w:instrText>
+              <w:instrText xml:space="preserve"> PAGEREF _Toc238986164 \h </w:instrText>
             </w:r>
             <w:r>
               <w:rPr>
@@ -3020,7 +3020,7 @@
               <w:sz w:val="24"/>
             </w:rPr>
           </w:pPr>
-          <w:hyperlink w:anchor="_Toc238982535" w:history="1">
+          <w:hyperlink w:anchor="_Toc238986165" w:history="1">
             <w:r>
               <w:rPr>
                 <w:rStyle w:val="Hyperlink"/>
@@ -3063,7 +3063,7 @@
                 <w:noProof/>
                 <w:webHidden/>
               </w:rPr>
-              <w:instrText xml:space="preserve"> PAGEREF _Toc238982535 \h </w:instrText>
+              <w:instrText xml:space="preserve"> PAGEREF _Toc238986165 \h </w:instrText>
             </w:r>
             <w:r>
               <w:rPr>
@@ -3106,7 +3106,7 @@
               <w:sz w:val="24"/>
             </w:rPr>
           </w:pPr>
-          <w:hyperlink w:anchor="_Toc238982536" w:history="1">
+          <w:hyperlink w:anchor="_Toc238986166" w:history="1">
             <w:r>
               <w:rPr>
                 <w:rStyle w:val="Hyperlink"/>
@@ -3134,7 +3134,7 @@
                 <w:noProof/>
                 <w:webHidden/>
               </w:rPr>
-              <w:instrText xml:space="preserve"> PAGEREF _Toc238982536 \h </w:instrText>
+              <w:instrText xml:space="preserve"> PAGEREF _Toc238986166 \h </w:instrText>
             </w:r>
             <w:r>
               <w:rPr>
@@ -3177,7 +3177,7 @@
               <w:sz w:val="24"/>
             </w:rPr>
           </w:pPr>
-          <w:hyperlink w:anchor="_Toc238982537" w:history="1">
+          <w:hyperlink w:anchor="_Toc238986167" w:history="1">
             <w:r>
               <w:rPr>
                 <w:rStyle w:val="Hyperlink"/>
@@ -3205,7 +3205,7 @@
                 <w:noProof/>
                 <w:webHidden/>
               </w:rPr>
-              <w:instrText xml:space="preserve"> PAGEREF _Toc238982537 \h </w:instrText>
+              <w:instrText xml:space="preserve"> PAGEREF _Toc238986167 \h </w:instrText>
             </w:r>
             <w:r>
               <w:rPr>
@@ -3248,7 +3248,7 @@
               <w:sz w:val="24"/>
             </w:rPr>
           </w:pPr>
-          <w:hyperlink w:anchor="_Toc238982538" w:history="1">
+          <w:hyperlink w:anchor="_Toc238986168" w:history="1">
             <w:r>
               <w:rPr>
                 <w:rStyle w:val="Hyperlink"/>
@@ -3276,7 +3276,7 @@
                 <w:noProof/>
                 <w:webHidden/>
               </w:rPr>
-              <w:instrText xml:space="preserve"> PAGEREF _Toc238982538 \h </w:instrText>
+              <w:instrText xml:space="preserve"> PAGEREF _Toc238986168 \h </w:instrText>
             </w:r>
             <w:r>
               <w:rPr>
@@ -3320,7 +3320,7 @@
               <w:sz w:val="24"/>
             </w:rPr>
           </w:pPr>
-          <w:hyperlink w:anchor="_Toc238982539" w:history="1">
+          <w:hyperlink w:anchor="_Toc238986169" w:history="1">
             <w:r>
               <w:rPr>
                 <w:rStyle w:val="Hyperlink"/>
@@ -3363,7 +3363,7 @@
                 <w:noProof/>
                 <w:webHidden/>
               </w:rPr>
-              <w:instrText xml:space="preserve"> PAGEREF _Toc238982539 \h </w:instrText>
+              <w:instrText xml:space="preserve"> PAGEREF _Toc238986169 \h </w:instrText>
             </w:r>
             <w:r>
               <w:rPr>
@@ -3406,7 +3406,7 @@
               <w:sz w:val="24"/>
             </w:rPr>
           </w:pPr>
-          <w:hyperlink w:anchor="_Toc238982540" w:history="1">
+          <w:hyperlink w:anchor="_Toc238986170" w:history="1">
             <w:r>
               <w:rPr>
                 <w:rStyle w:val="Hyperlink"/>
@@ -3434,7 +3434,7 @@
                 <w:noProof/>
                 <w:webHidden/>
               </w:rPr>
-              <w:instrText xml:space="preserve"> PAGEREF _Toc238982540 \h </w:instrText>
+              <w:instrText xml:space="preserve"> PAGEREF _Toc238986170 \h </w:instrText>
             </w:r>
             <w:r>
               <w:rPr>
@@ -3477,7 +3477,7 @@
               <w:sz w:val="24"/>
             </w:rPr>
           </w:pPr>
-          <w:hyperlink w:anchor="_Toc238982541" w:history="1">
+          <w:hyperlink w:anchor="_Toc238986171" w:history="1">
             <w:r>
               <w:rPr>
                 <w:rStyle w:val="Hyperlink"/>
@@ -3505,7 +3505,7 @@
                 <w:noProof/>
                 <w:webHidden/>
               </w:rPr>
-              <w:instrText xml:space="preserve"> PAGEREF _Toc238982541 \h </w:instrText>
+              <w:instrText xml:space="preserve"> PAGEREF _Toc238986171 \h </w:instrText>
             </w:r>
             <w:r>
               <w:rPr>
@@ -3548,7 +3548,7 @@
               <w:sz w:val="24"/>
             </w:rPr>
           </w:pPr>
-          <w:hyperlink w:anchor="_Toc238982542" w:history="1">
+          <w:hyperlink w:anchor="_Toc238986172" w:history="1">
             <w:r>
               <w:rPr>
                 <w:rStyle w:val="Hyperlink"/>
@@ -3576,7 +3576,7 @@
                 <w:noProof/>
                 <w:webHidden/>
               </w:rPr>
-              <w:instrText xml:space="preserve"> PAGEREF _Toc238982542 \h </w:instrText>
+              <w:instrText xml:space="preserve"> PAGEREF _Toc238986172 \h </w:instrText>
             </w:r>
             <w:r>
               <w:rPr>
@@ -3619,7 +3619,7 @@
               <w:sz w:val="24"/>
             </w:rPr>
           </w:pPr>
-          <w:hyperlink w:anchor="_Toc238982543" w:history="1">
+          <w:hyperlink w:anchor="_Toc238986173" w:history="1">
             <w:r>
               <w:rPr>
                 <w:rStyle w:val="Hyperlink"/>
@@ -3647,7 +3647,7 @@
                 <w:noProof/>
                 <w:webHidden/>
               </w:rPr>
-              <w:instrText xml:space="preserve"> PAGEREF _Toc238982543 \h </w:instrText>
+              <w:instrText xml:space="preserve"> PAGEREF _Toc238986173 \h </w:instrText>
             </w:r>
             <w:r>
               <w:rPr>
@@ -3690,7 +3690,7 @@
               <w:sz w:val="24"/>
             </w:rPr>
           </w:pPr>
-          <w:hyperlink w:anchor="_Toc238982544" w:history="1">
+          <w:hyperlink w:anchor="_Toc238986174" w:history="1">
             <w:r>
               <w:rPr>
                 <w:rStyle w:val="Hyperlink"/>
@@ -3718,7 +3718,7 @@
                 <w:noProof/>
                 <w:webHidden/>
               </w:rPr>
-              <w:instrText xml:space="preserve"> PAGEREF _Toc238982544 \h </w:instrText>
+              <w:instrText xml:space="preserve"> PAGEREF _Toc238986174 \h </w:instrText>
             </w:r>
             <w:r>
               <w:rPr>
@@ -3761,7 +3761,7 @@
               <w:sz w:val="24"/>
             </w:rPr>
           </w:pPr>
-          <w:hyperlink w:anchor="_Toc238982545" w:history="1">
+          <w:hyperlink w:anchor="_Toc238986175" w:history="1">
             <w:r>
               <w:rPr>
                 <w:rStyle w:val="Hyperlink"/>
@@ -3789,7 +3789,7 @@
                 <w:noProof/>
                 <w:webHidden/>
               </w:rPr>
-              <w:instrText xml:space="preserve"> PAGEREF _Toc238982545 \h </w:instrText>
+              <w:instrText xml:space="preserve"> PAGEREF _Toc238986175 \h </w:instrText>
             </w:r>
             <w:r>
               <w:rPr>
@@ -3832,7 +3832,7 @@
               <w:sz w:val="24"/>
             </w:rPr>
           </w:pPr>
-          <w:hyperlink w:anchor="_Toc238982546" w:history="1">
+          <w:hyperlink w:anchor="_Toc238986176" w:history="1">
             <w:r>
               <w:rPr>
                 <w:rStyle w:val="Hyperlink"/>
@@ -3860,7 +3860,7 @@
                 <w:noProof/>
                 <w:webHidden/>
               </w:rPr>
-              <w:instrText xml:space="preserve"> PAGEREF _Toc238982546 \h </w:instrText>
+              <w:instrText xml:space="preserve"> PAGEREF _Toc238986176 \h </w:instrText>
             </w:r>
             <w:r>
               <w:rPr>
@@ -3903,7 +3903,7 @@
               <w:sz w:val="24"/>
             </w:rPr>
           </w:pPr>
-          <w:hyperlink w:anchor="_Toc238982547" w:history="1">
+          <w:hyperlink w:anchor="_Toc238986177" w:history="1">
             <w:r>
               <w:rPr>
                 <w:rStyle w:val="Hyperlink"/>
@@ -3931,7 +3931,7 @@
                 <w:noProof/>
                 <w:webHidden/>
               </w:rPr>
-              <w:instrText xml:space="preserve"> PAGEREF _Toc238982547 \h </w:instrText>
+              <w:instrText xml:space="preserve"> PAGEREF _Toc238986177 \h </w:instrText>
             </w:r>
             <w:r>
               <w:rPr>
@@ -3974,7 +3974,7 @@
               <w:sz w:val="24"/>
             </w:rPr>
           </w:pPr>
-          <w:hyperlink w:anchor="_Toc238982548" w:history="1">
+          <w:hyperlink w:anchor="_Toc238986178" w:history="1">
             <w:r>
               <w:rPr>
                 <w:rStyle w:val="Hyperlink"/>
@@ -4002,7 +4002,7 @@
                 <w:noProof/>
                 <w:webHidden/>
               </w:rPr>
-              <w:instrText xml:space="preserve"> PAGEREF _Toc238982548 \h </w:instrText>
+              <w:instrText xml:space="preserve"> PAGEREF _Toc238986178 \h </w:instrText>
             </w:r>
             <w:r>
               <w:rPr>
@@ -4045,7 +4045,7 @@
               <w:sz w:val="24"/>
             </w:rPr>
           </w:pPr>
-          <w:hyperlink w:anchor="_Toc238982549" w:history="1">
+          <w:hyperlink w:anchor="_Toc238986179" w:history="1">
             <w:r>
               <w:rPr>
                 <w:rStyle w:val="Hyperlink"/>
@@ -4073,7 +4073,7 @@
                 <w:noProof/>
                 <w:webHidden/>
               </w:rPr>
-              <w:instrText xml:space="preserve"> PAGEREF _Toc238982549 \h </w:instrText>
+              <w:instrText xml:space="preserve"> PAGEREF _Toc238986179 \h </w:instrText>
             </w:r>
             <w:r>
               <w:rPr>
@@ -4117,7 +4117,7 @@
               <w:sz w:val="24"/>
             </w:rPr>
           </w:pPr>
-          <w:hyperlink w:anchor="_Toc238982550" w:history="1">
+          <w:hyperlink w:anchor="_Toc238986180" w:history="1">
             <w:r>
               <w:rPr>
                 <w:rStyle w:val="Hyperlink"/>
@@ -4160,7 +4160,7 @@
                 <w:noProof/>
                 <w:webHidden/>
               </w:rPr>
-              <w:instrText xml:space="preserve"> PAGEREF _Toc238982550 \h </w:instrText>
+              <w:instrText xml:space="preserve"> PAGEREF _Toc238986180 \h </w:instrText>
             </w:r>
             <w:r>
               <w:rPr>
@@ -4203,7 +4203,7 @@
               <w:sz w:val="24"/>
             </w:rPr>
           </w:pPr>
-          <w:hyperlink w:anchor="_Toc238982551" w:history="1">
+          <w:hyperlink w:anchor="_Toc238986181" w:history="1">
             <w:r>
               <w:rPr>
                 <w:rStyle w:val="Hyperlink"/>
@@ -4231,7 +4231,7 @@
                 <w:noProof/>
                 <w:webHidden/>
               </w:rPr>
-              <w:instrText xml:space="preserve"> PAGEREF _Toc238982551 \h </w:instrText>
+              <w:instrText xml:space="preserve"> PAGEREF _Toc238986181 \h </w:instrText>
             </w:r>
             <w:r>
               <w:rPr>
@@ -4274,7 +4274,7 @@
               <w:sz w:val="24"/>
             </w:rPr>
           </w:pPr>
-          <w:hyperlink w:anchor="_Toc238982552" w:history="1">
+          <w:hyperlink w:anchor="_Toc238986182" w:history="1">
             <w:r>
               <w:rPr>
                 <w:rStyle w:val="Hyperlink"/>
@@ -4302,7 +4302,7 @@
                 <w:noProof/>
                 <w:webHidden/>
               </w:rPr>
-              <w:instrText xml:space="preserve"> PAGEREF _Toc238982552 \h </w:instrText>
+              <w:instrText xml:space="preserve"> PAGEREF _Toc238986182 \h </w:instrText>
             </w:r>
             <w:r>
               <w:rPr>
@@ -4345,7 +4345,7 @@
               <w:sz w:val="24"/>
             </w:rPr>
           </w:pPr>
-          <w:hyperlink w:anchor="_Toc238982553" w:history="1">
+          <w:hyperlink w:anchor="_Toc238986183" w:history="1">
             <w:r>
               <w:rPr>
                 <w:rStyle w:val="Hyperlink"/>
@@ -4373,7 +4373,7 @@
                 <w:noProof/>
                 <w:webHidden/>
               </w:rPr>
-              <w:instrText xml:space="preserve"> PAGEREF _Toc238982553 \h </w:instrText>
+              <w:instrText xml:space="preserve"> PAGEREF _Toc238986183 \h </w:instrText>
             </w:r>
             <w:r>
               <w:rPr>
@@ -4416,7 +4416,7 @@
               <w:sz w:val="24"/>
             </w:rPr>
           </w:pPr>
-          <w:hyperlink w:anchor="_Toc238982554" w:history="1">
+          <w:hyperlink w:anchor="_Toc238986184" w:history="1">
             <w:r>
               <w:rPr>
                 <w:rStyle w:val="Hyperlink"/>
@@ -4444,7 +4444,7 @@
                 <w:noProof/>
                 <w:webHidden/>
               </w:rPr>
-              <w:instrText xml:space="preserve"> PAGEREF _Toc238982554 \h </w:instrText>
+              <w:instrText xml:space="preserve"> PAGEREF _Toc238986184 \h </w:instrText>
             </w:r>
             <w:r>
               <w:rPr>
@@ -4487,7 +4487,7 @@
               <w:sz w:val="24"/>
             </w:rPr>
           </w:pPr>
-          <w:hyperlink w:anchor="_Toc238982555" w:history="1">
+          <w:hyperlink w:anchor="_Toc238986185" w:history="1">
             <w:r>
               <w:rPr>
                 <w:rStyle w:val="Hyperlink"/>
@@ -4515,7 +4515,7 @@
                 <w:noProof/>
                 <w:webHidden/>
               </w:rPr>
-              <w:instrText xml:space="preserve"> PAGEREF _Toc238982555 \h </w:instrText>
+              <w:instrText xml:space="preserve"> PAGEREF _Toc238986185 \h </w:instrText>
             </w:r>
             <w:r>
               <w:rPr>
@@ -4558,7 +4558,7 @@
               <w:sz w:val="24"/>
             </w:rPr>
           </w:pPr>
-          <w:hyperlink w:anchor="_Toc238982556" w:history="1">
+          <w:hyperlink w:anchor="_Toc238986186" w:history="1">
             <w:r>
               <w:rPr>
                 <w:rStyle w:val="Hyperlink"/>
@@ -4586,7 +4586,7 @@
                 <w:noProof/>
                 <w:webHidden/>
               </w:rPr>
-              <w:instrText xml:space="preserve"> PAGEREF _Toc238982556 \h </w:instrText>
+              <w:instrText xml:space="preserve"> PAGEREF _Toc238986186 \h </w:instrText>
             </w:r>
             <w:r>
               <w:rPr>
@@ -4630,7 +4630,7 @@
               <w:sz w:val="24"/>
             </w:rPr>
           </w:pPr>
-          <w:hyperlink w:anchor="_Toc238982557" w:history="1">
+          <w:hyperlink w:anchor="_Toc238986187" w:history="1">
             <w:r>
               <w:rPr>
                 <w:rStyle w:val="Hyperlink"/>
@@ -4673,7 +4673,7 @@
                 <w:noProof/>
                 <w:webHidden/>
               </w:rPr>
-              <w:instrText xml:space="preserve"> PAGEREF _Toc238982557 \h </w:instrText>
+              <w:instrText xml:space="preserve"> PAGEREF _Toc238986187 \h </w:instrText>
             </w:r>
             <w:r>
               <w:rPr>
@@ -4716,7 +4716,7 @@
               <w:sz w:val="24"/>
             </w:rPr>
           </w:pPr>
-          <w:hyperlink w:anchor="_Toc238982558" w:history="1">
+          <w:hyperlink w:anchor="_Toc238986188" w:history="1">
             <w:r>
               <w:rPr>
                 <w:rStyle w:val="Hyperlink"/>
@@ -4744,7 +4744,7 @@
                 <w:noProof/>
                 <w:webHidden/>
               </w:rPr>
-              <w:instrText xml:space="preserve"> PAGEREF _Toc238982558 \h </w:instrText>
+              <w:instrText xml:space="preserve"> PAGEREF _Toc238986188 \h </w:instrText>
             </w:r>
             <w:r>
               <w:rPr>
@@ -4787,7 +4787,7 @@
               <w:sz w:val="24"/>
             </w:rPr>
           </w:pPr>
-          <w:hyperlink w:anchor="_Toc238982559" w:history="1">
+          <w:hyperlink w:anchor="_Toc238986189" w:history="1">
             <w:r>
               <w:rPr>
                 <w:rStyle w:val="Hyperlink"/>
@@ -4815,7 +4815,7 @@
                 <w:noProof/>
                 <w:webHidden/>
               </w:rPr>
-              <w:instrText xml:space="preserve"> PAGEREF _Toc238982559 \h </w:instrText>
+              <w:instrText xml:space="preserve"> PAGEREF _Toc238986189 \h </w:instrText>
             </w:r>
             <w:r>
               <w:rPr>
@@ -4858,7 +4858,7 @@
               <w:sz w:val="24"/>
             </w:rPr>
           </w:pPr>
-          <w:hyperlink w:anchor="_Toc238982560" w:history="1">
+          <w:hyperlink w:anchor="_Toc238986190" w:history="1">
             <w:r>
               <w:rPr>
                 <w:rStyle w:val="Hyperlink"/>
@@ -4886,7 +4886,7 @@
                 <w:noProof/>
                 <w:webHidden/>
               </w:rPr>
-              <w:instrText xml:space="preserve"> PAGEREF _Toc238982560 \h </w:instrText>
+              <w:instrText xml:space="preserve"> PAGEREF _Toc238986190 \h </w:instrText>
             </w:r>
             <w:r>
               <w:rPr>
@@ -4930,7 +4930,7 @@
               <w:sz w:val="24"/>
             </w:rPr>
           </w:pPr>
-          <w:hyperlink w:anchor="_Toc238982561" w:history="1">
+          <w:hyperlink w:anchor="_Toc238986191" w:history="1">
             <w:r>
               <w:rPr>
                 <w:rStyle w:val="Hyperlink"/>
@@ -4973,7 +4973,7 @@
                 <w:noProof/>
                 <w:webHidden/>
               </w:rPr>
-              <w:instrText xml:space="preserve"> PAGEREF _Toc238982561 \h </w:instrText>
+              <w:instrText xml:space="preserve"> PAGEREF _Toc238986191 \h </w:instrText>
             </w:r>
             <w:r>
               <w:rPr>
@@ -5016,7 +5016,7 @@
               <w:sz w:val="24"/>
             </w:rPr>
           </w:pPr>
-          <w:hyperlink w:anchor="_Toc238982562" w:history="1">
+          <w:hyperlink w:anchor="_Toc238986192" w:history="1">
             <w:r>
               <w:rPr>
                 <w:rStyle w:val="Hyperlink"/>
@@ -5044,7 +5044,7 @@
                 <w:noProof/>
                 <w:webHidden/>
               </w:rPr>
-              <w:instrText xml:space="preserve"> PAGEREF _Toc238982562 \h </w:instrText>
+              <w:instrText xml:space="preserve"> PAGEREF _Toc238986192 \h </w:instrText>
             </w:r>
             <w:r>
               <w:rPr>
@@ -5087,7 +5087,7 @@
               <w:sz w:val="24"/>
             </w:rPr>
           </w:pPr>
-          <w:hyperlink w:anchor="_Toc238982563" w:history="1">
+          <w:hyperlink w:anchor="_Toc238986193" w:history="1">
             <w:r>
               <w:rPr>
                 <w:rStyle w:val="Hyperlink"/>
@@ -5115,7 +5115,7 @@
                 <w:noProof/>
                 <w:webHidden/>
               </w:rPr>
-              <w:instrText xml:space="preserve"> PAGEREF _Toc238982563 \h </w:instrText>
+              <w:instrText xml:space="preserve"> PAGEREF _Toc238986193 \h </w:instrText>
             </w:r>
             <w:r>
               <w:rPr>
@@ -5158,7 +5158,7 @@
               <w:sz w:val="24"/>
             </w:rPr>
           </w:pPr>
-          <w:hyperlink w:anchor="_Toc238982564" w:history="1">
+          <w:hyperlink w:anchor="_Toc238986194" w:history="1">
             <w:r>
               <w:rPr>
                 <w:rStyle w:val="Hyperlink"/>
@@ -5186,7 +5186,7 @@
                 <w:noProof/>
                 <w:webHidden/>
               </w:rPr>
-              <w:instrText xml:space="preserve"> PAGEREF _Toc238982564 \h </w:instrText>
+              <w:instrText xml:space="preserve"> PAGEREF _Toc238986194 \h </w:instrText>
             </w:r>
             <w:r>
               <w:rPr>
@@ -5229,7 +5229,7 @@
               <w:sz w:val="24"/>
             </w:rPr>
           </w:pPr>
-          <w:hyperlink w:anchor="_Toc238982565" w:history="1">
+          <w:hyperlink w:anchor="_Toc238986195" w:history="1">
             <w:r>
               <w:rPr>
                 <w:rStyle w:val="Hyperlink"/>
@@ -5257,7 +5257,7 @@
                 <w:noProof/>
                 <w:webHidden/>
               </w:rPr>
-              <w:instrText xml:space="preserve"> PAGEREF _Toc238982565 \h </w:instrText>
+              <w:instrText xml:space="preserve"> PAGEREF _Toc238986195 \h </w:instrText>
             </w:r>
             <w:r>
               <w:rPr>
@@ -5300,7 +5300,7 @@
               <w:sz w:val="24"/>
             </w:rPr>
           </w:pPr>
-          <w:hyperlink w:anchor="_Toc238982566" w:history="1">
+          <w:hyperlink w:anchor="_Toc238986196" w:history="1">
             <w:r>
               <w:rPr>
                 <w:rStyle w:val="Hyperlink"/>
@@ -5328,7 +5328,7 @@
                 <w:noProof/>
                 <w:webHidden/>
               </w:rPr>
-              <w:instrText xml:space="preserve"> PAGEREF _Toc238982566 \h </w:instrText>
+              <w:instrText xml:space="preserve"> PAGEREF _Toc238986196 \h </w:instrText>
             </w:r>
             <w:r>
               <w:rPr>
@@ -5371,7 +5371,7 @@
               <w:sz w:val="24"/>
             </w:rPr>
           </w:pPr>
-          <w:hyperlink w:anchor="_Toc238982567" w:history="1">
+          <w:hyperlink w:anchor="_Toc238986197" w:history="1">
             <w:r>
               <w:rPr>
                 <w:rStyle w:val="Hyperlink"/>
@@ -5399,7 +5399,7 @@
                 <w:noProof/>
                 <w:webHidden/>
               </w:rPr>
-              <w:instrText xml:space="preserve"> PAGEREF _Toc238982567 \h </w:instrText>
+              <w:instrText xml:space="preserve"> PAGEREF _Toc238986197 \h </w:instrText>
             </w:r>
             <w:r>
               <w:rPr>
@@ -5443,7 +5443,7 @@
               <w:sz w:val="24"/>
             </w:rPr>
           </w:pPr>
-          <w:hyperlink w:anchor="_Toc238982568" w:history="1">
+          <w:hyperlink w:anchor="_Toc238986198" w:history="1">
             <w:r>
               <w:rPr>
                 <w:rStyle w:val="Hyperlink"/>
@@ -5486,7 +5486,7 @@
                 <w:noProof/>
                 <w:webHidden/>
               </w:rPr>
-              <w:instrText xml:space="preserve"> PAGEREF _Toc238982568 \h </w:instrText>
+              <w:instrText xml:space="preserve"> PAGEREF _Toc238986198 \h </w:instrText>
             </w:r>
             <w:r>
               <w:rPr>
@@ -5529,7 +5529,7 @@
               <w:sz w:val="24"/>
             </w:rPr>
           </w:pPr>
-          <w:hyperlink w:anchor="_Toc238982569" w:history="1">
+          <w:hyperlink w:anchor="_Toc238986199" w:history="1">
             <w:r>
               <w:rPr>
                 <w:rStyle w:val="Hyperlink"/>
@@ -5557,7 +5557,7 @@
                 <w:noProof/>
                 <w:webHidden/>
               </w:rPr>
-              <w:instrText xml:space="preserve"> PAGEREF _Toc238982569 \h </w:instrText>
+              <w:instrText xml:space="preserve"> PAGEREF _Toc238986199 \h </w:instrText>
             </w:r>
             <w:r>
               <w:rPr>
@@ -5600,7 +5600,7 @@
               <w:sz w:val="24"/>
             </w:rPr>
           </w:pPr>
-          <w:hyperlink w:anchor="_Toc238982570" w:history="1">
+          <w:hyperlink w:anchor="_Toc238986200" w:history="1">
             <w:r>
               <w:rPr>
                 <w:rStyle w:val="Hyperlink"/>
@@ -5628,7 +5628,7 @@
                 <w:noProof/>
                 <w:webHidden/>
               </w:rPr>
-              <w:instrText xml:space="preserve"> PAGEREF _Toc238982570 \h </w:instrText>
+              <w:instrText xml:space="preserve"> PAGEREF _Toc238986200 \h </w:instrText>
             </w:r>
             <w:r>
               <w:rPr>
@@ -5672,7 +5672,7 @@
               <w:sz w:val="24"/>
             </w:rPr>
           </w:pPr>
-          <w:hyperlink w:anchor="_Toc238982571" w:history="1">
+          <w:hyperlink w:anchor="_Toc238986201" w:history="1">
             <w:r>
               <w:rPr>
                 <w:rStyle w:val="Hyperlink"/>
@@ -5715,7 +5715,7 @@
                 <w:noProof/>
                 <w:webHidden/>
               </w:rPr>
-              <w:instrText xml:space="preserve"> PAGEREF _Toc238982571 \h </w:instrText>
+              <w:instrText xml:space="preserve"> PAGEREF _Toc238986201 \h </w:instrText>
             </w:r>
             <w:r>
               <w:rPr>
@@ -5758,7 +5758,7 @@
               <w:sz w:val="24"/>
             </w:rPr>
           </w:pPr>
-          <w:hyperlink w:anchor="_Toc238982572" w:history="1">
+          <w:hyperlink w:anchor="_Toc238986202" w:history="1">
             <w:r>
               <w:rPr>
                 <w:rStyle w:val="Hyperlink"/>
@@ -5786,7 +5786,7 @@
                 <w:noProof/>
                 <w:webHidden/>
               </w:rPr>
-              <w:instrText xml:space="preserve"> PAGEREF _Toc238982572 \h </w:instrText>
+              <w:instrText xml:space="preserve"> PAGEREF _Toc238986202 \h </w:instrText>
             </w:r>
             <w:r>
               <w:rPr>
@@ -5829,7 +5829,7 @@
               <w:sz w:val="24"/>
             </w:rPr>
           </w:pPr>
-          <w:hyperlink w:anchor="_Toc238982573" w:history="1">
+          <w:hyperlink w:anchor="_Toc238986203" w:history="1">
             <w:r>
               <w:rPr>
                 <w:rStyle w:val="Hyperlink"/>
@@ -5857,7 +5857,7 @@
                 <w:noProof/>
                 <w:webHidden/>
               </w:rPr>
-              <w:instrText xml:space="preserve"> PAGEREF _Toc238982573 \h </w:instrText>
+              <w:instrText xml:space="preserve"> PAGEREF _Toc238986203 \h </w:instrText>
             </w:r>
             <w:r>
               <w:rPr>
@@ -5901,7 +5901,7 @@
               <w:sz w:val="24"/>
             </w:rPr>
           </w:pPr>
-          <w:hyperlink w:anchor="_Toc238982574" w:history="1">
+          <w:hyperlink w:anchor="_Toc238986204" w:history="1">
             <w:r>
               <w:rPr>
                 <w:rStyle w:val="Hyperlink"/>
@@ -5944,7 +5944,7 @@
                 <w:noProof/>
                 <w:webHidden/>
               </w:rPr>
-              <w:instrText xml:space="preserve"> PAGEREF _Toc238982574 \h </w:instrText>
+              <w:instrText xml:space="preserve"> PAGEREF _Toc238986204 \h </w:instrText>
             </w:r>
             <w:r>
               <w:rPr>
@@ -5987,7 +5987,7 @@
               <w:sz w:val="24"/>
             </w:rPr>
           </w:pPr>
-          <w:hyperlink w:anchor="_Toc238982575" w:history="1">
+          <w:hyperlink w:anchor="_Toc238986205" w:history="1">
             <w:r>
               <w:rPr>
                 <w:rStyle w:val="Hyperlink"/>
@@ -6015,7 +6015,7 @@
                 <w:noProof/>
                 <w:webHidden/>
               </w:rPr>
-              <w:instrText xml:space="preserve"> PAGEREF _Toc238982575 \h </w:instrText>
+              <w:instrText xml:space="preserve"> PAGEREF _Toc238986205 \h </w:instrText>
             </w:r>
             <w:r>
               <w:rPr>
@@ -6058,7 +6058,7 @@
               <w:sz w:val="24"/>
             </w:rPr>
           </w:pPr>
-          <w:hyperlink w:anchor="_Toc238982576" w:history="1">
+          <w:hyperlink w:anchor="_Toc238986206" w:history="1">
             <w:r>
               <w:rPr>
                 <w:rStyle w:val="Hyperlink"/>
@@ -6086,7 +6086,7 @@
                 <w:noProof/>
                 <w:webHidden/>
               </w:rPr>
-              <w:instrText xml:space="preserve"> PAGEREF _Toc238982576 \h </w:instrText>
+              <w:instrText xml:space="preserve"> PAGEREF _Toc238986206 \h </w:instrText>
             </w:r>
             <w:r>
               <w:rPr>
@@ -6129,7 +6129,7 @@
               <w:sz w:val="24"/>
             </w:rPr>
           </w:pPr>
-          <w:hyperlink w:anchor="_Toc238982577" w:history="1">
+          <w:hyperlink w:anchor="_Toc238986207" w:history="1">
             <w:r>
               <w:rPr>
                 <w:rStyle w:val="Hyperlink"/>
@@ -6157,7 +6157,7 @@
                 <w:noProof/>
                 <w:webHidden/>
               </w:rPr>
-              <w:instrText xml:space="preserve"> PAGEREF _Toc238982577 \h </w:instrText>
+              <w:instrText xml:space="preserve"> PAGEREF _Toc238986207 \h </w:instrText>
             </w:r>
             <w:r>
               <w:rPr>
@@ -6201,7 +6201,7 @@
               <w:sz w:val="24"/>
             </w:rPr>
           </w:pPr>
-          <w:hyperlink w:anchor="_Toc238982578" w:history="1">
+          <w:hyperlink w:anchor="_Toc238986208" w:history="1">
             <w:r>
               <w:rPr>
                 <w:rStyle w:val="Hyperlink"/>
@@ -6244,7 +6244,7 @@
                 <w:noProof/>
                 <w:webHidden/>
               </w:rPr>
-              <w:instrText xml:space="preserve"> PAGEREF _Toc238982578 \h </w:instrText>
+              <w:instrText xml:space="preserve"> PAGEREF _Toc238986208 \h </w:instrText>
             </w:r>
             <w:r>
               <w:rPr>
@@ -6297,7 +6297,7 @@
       <w:pPr>
         <w:pStyle w:val="Heading2"/>
       </w:pPr>
-      <w:bookmarkStart w:id="0" w:name="_Toc238982497"/>
+      <w:bookmarkStart w:id="0" w:name="_Toc238986127"/>
       <w:r>
         <w:rPr>
           <w:rFonts w:eastAsia="Wavehaus 128 Bold" w:cs="Wavehaus 128 Bold"/>
@@ -6342,7 +6342,7 @@
       <w:pPr>
         <w:pStyle w:val="Heading3"/>
       </w:pPr>
-      <w:bookmarkStart w:id="1" w:name="_Toc238982498"/>
+      <w:bookmarkStart w:id="1" w:name="_Toc238986128"/>
       <w:r>
         <w:rPr>
           <w:rFonts w:ascii="Wavehaus 128 Bold" w:eastAsia="Wavehaus 128 Bold" w:hAnsi="Wavehaus 128 Bold" w:cs="Wavehaus 128 Bold"/>
@@ -6589,7 +6589,7 @@
       <w:pPr>
         <w:pStyle w:val="Heading3"/>
       </w:pPr>
-      <w:bookmarkStart w:id="2" w:name="_Toc238982499"/>
+      <w:bookmarkStart w:id="2" w:name="_Toc238986129"/>
       <w:r>
         <w:rPr>
           <w:rFonts w:ascii="Wavehaus 128 Bold" w:eastAsia="Wavehaus 128 Bold" w:hAnsi="Wavehaus 128 Bold" w:cs="Wavehaus 128 Bold"/>
@@ -6723,7 +6723,7 @@
       <w:pPr>
         <w:pStyle w:val="Heading3"/>
       </w:pPr>
-      <w:bookmarkStart w:id="3" w:name="_Toc238982500"/>
+      <w:bookmarkStart w:id="3" w:name="_Toc238986130"/>
       <w:r>
         <w:rPr>
           <w:rFonts w:ascii="Wavehaus 128 Bold" w:eastAsia="Wavehaus 128 Bold" w:hAnsi="Wavehaus 128 Bold" w:cs="Wavehaus 128 Bold"/>
@@ -6990,7 +6990,7 @@
       <w:pPr>
         <w:pStyle w:val="Heading2"/>
       </w:pPr>
-      <w:bookmarkStart w:id="4" w:name="_Toc238982501"/>
+      <w:bookmarkStart w:id="4" w:name="_Toc238986131"/>
       <w:r>
         <w:rPr>
           <w:rFonts w:eastAsia="Wavehaus 128 Bold" w:cs="Wavehaus 128 Bold"/>
@@ -7016,7 +7016,7 @@
       <w:pPr>
         <w:pStyle w:val="Heading3"/>
       </w:pPr>
-      <w:bookmarkStart w:id="5" w:name="_Toc238982502"/>
+      <w:bookmarkStart w:id="5" w:name="_Toc238986132"/>
       <w:r>
         <w:rPr>
           <w:rFonts w:ascii="Wavehaus 128 Bold" w:eastAsia="Wavehaus 128 Bold" w:hAnsi="Wavehaus 128 Bold" w:cs="Wavehaus 128 Bold"/>
@@ -7234,7 +7234,7 @@
       <w:pPr>
         <w:pStyle w:val="Heading3"/>
       </w:pPr>
-      <w:bookmarkStart w:id="6" w:name="_Toc238982503"/>
+      <w:bookmarkStart w:id="6" w:name="_Toc238986133"/>
       <w:r>
         <w:rPr>
           <w:rFonts w:ascii="Wavehaus 128 Bold" w:eastAsia="Wavehaus 128 Bold" w:hAnsi="Wavehaus 128 Bold" w:cs="Wavehaus 128 Bold"/>
@@ -7809,7 +7809,7 @@
       <w:pPr>
         <w:pStyle w:val="Heading3"/>
       </w:pPr>
-      <w:bookmarkStart w:id="7" w:name="_Toc238982504"/>
+      <w:bookmarkStart w:id="7" w:name="_Toc238986134"/>
       <w:r>
         <w:rPr>
           <w:rFonts w:ascii="Wavehaus 128 Bold" w:eastAsia="Wavehaus 128 Bold" w:hAnsi="Wavehaus 128 Bold" w:cs="Wavehaus 128 Bold"/>
@@ -8248,7 +8248,7 @@
       <w:pPr>
         <w:pStyle w:val="Heading3"/>
       </w:pPr>
-      <w:bookmarkStart w:id="8" w:name="_Toc238982505"/>
+      <w:bookmarkStart w:id="8" w:name="_Toc238986135"/>
       <w:r>
         <w:rPr>
           <w:rFonts w:ascii="Wavehaus 128 Bold" w:eastAsia="Wavehaus 128 Bold" w:hAnsi="Wavehaus 128 Bold" w:cs="Wavehaus 128 Bold"/>
@@ -8426,7 +8426,7 @@
       <w:pPr>
         <w:pStyle w:val="Heading2"/>
       </w:pPr>
-      <w:bookmarkStart w:id="9" w:name="_Toc238982506"/>
+      <w:bookmarkStart w:id="9" w:name="_Toc238986136"/>
       <w:r>
         <w:rPr>
           <w:rFonts w:eastAsia="Wavehaus 128 Bold" w:cs="Wavehaus 128 Bold"/>
@@ -8466,7 +8466,7 @@
       <w:pPr>
         <w:pStyle w:val="Heading3"/>
       </w:pPr>
-      <w:bookmarkStart w:id="10" w:name="_Toc238982507"/>
+      <w:bookmarkStart w:id="10" w:name="_Toc238986137"/>
       <w:r>
         <w:rPr>
           <w:rFonts w:ascii="Wavehaus 128 Bold" w:eastAsia="Wavehaus 128 Bold" w:hAnsi="Wavehaus 128 Bold" w:cs="Wavehaus 128 Bold"/>
@@ -9621,7 +9621,7 @@
       <w:pPr>
         <w:pStyle w:val="Heading3"/>
       </w:pPr>
-      <w:bookmarkStart w:id="11" w:name="_Toc238982508"/>
+      <w:bookmarkStart w:id="11" w:name="_Toc238986138"/>
       <w:r>
         <w:rPr>
           <w:rFonts w:ascii="Wavehaus 128 Bold" w:eastAsia="Wavehaus 128 Bold" w:hAnsi="Wavehaus 128 Bold" w:cs="Wavehaus 128 Bold"/>
@@ -10162,31 +10162,59 @@
                 <w:rFonts w:ascii="Consolas" w:eastAsia="Consolas" w:hAnsi="Consolas" w:cs="Consolas"/>
                 <w:sz w:val="20"/>
               </w:rPr>
+              <w:t>desktop/ci/</w:t>
+            </w:r>
+          </w:p>
+        </w:tc>
+        <w:tc>
+          <w:tcPr>
+            <w:tcW w:w="4513" w:type="dxa"/>
+          </w:tcPr>
+          <w:p>
+            <w:pPr>
+              <w:spacing w:before="20" w:after="20" w:line="252" w:lineRule="auto"/>
+            </w:pPr>
+            <w:r>
+              <w:rPr>
+                <w:rFonts w:ascii="Consolas" w:eastAsia="Consolas" w:hAnsi="Consolas" w:cs="Consolas"/>
+                <w:sz w:val="20"/>
+              </w:rPr>
+              <w:t>desktop-release.yml</w:t>
+            </w:r>
+            <w:r>
+              <w:rPr>
+                <w:rFonts w:ascii="Wavehaus 42 Light" w:eastAsia="Wavehaus 42 Light" w:hAnsi="Wavehaus 42 Light" w:cs="Wavehaus 42 Light"/>
+                <w:sz w:val="20"/>
+              </w:rPr>
+              <w:t xml:space="preserve">, which builds the Windows, macOS and Linux packages on their own runners - the only place the last two can be built at all. Parked here rather than in </w:t>
+            </w:r>
+            <w:r>
+              <w:rPr>
+                <w:rFonts w:ascii="Consolas" w:eastAsia="Consolas" w:hAnsi="Consolas" w:cs="Consolas"/>
+                <w:sz w:val="20"/>
+              </w:rPr>
               <w:t>.github/workflows/</w:t>
             </w:r>
-          </w:p>
-        </w:tc>
-        <w:tc>
-          <w:tcPr>
-            <w:tcW w:w="4513" w:type="dxa"/>
-          </w:tcPr>
-          <w:p>
-            <w:pPr>
-              <w:spacing w:before="20" w:after="20" w:line="252" w:lineRule="auto"/>
-            </w:pPr>
+            <w:r>
+              <w:rPr>
+                <w:rFonts w:ascii="Wavehaus 42 Light" w:eastAsia="Wavehaus 42 Light" w:hAnsi="Wavehaus 42 Light" w:cs="Wavehaus 42 Light"/>
+                <w:sz w:val="20"/>
+              </w:rPr>
+              <w:t xml:space="preserve">; </w:t>
+            </w:r>
             <w:r>
               <w:rPr>
                 <w:rFonts w:ascii="Consolas" w:eastAsia="Consolas" w:hAnsi="Consolas" w:cs="Consolas"/>
                 <w:sz w:val="20"/>
               </w:rPr>
-              <w:t>desktop-release.yml</w:t>
-            </w:r>
-            <w:r>
-              <w:rPr>
-                <w:rFonts w:ascii="Wavehaus 42 Light" w:eastAsia="Wavehaus 42 Light" w:hAnsi="Wavehaus 42 Light" w:cs="Wavehaus 42 Light"/>
-                <w:sz w:val="20"/>
-              </w:rPr>
-              <w:t>, which builds the Windows, macOS and Linux packages on their own runners - the only place the last two can be built at all</w:t>
+              <w:t>ci/README.md</w:t>
+            </w:r>
+            <w:r>
+              <w:rPr>
+                <w:rFonts w:ascii="Wavehaus 42 Light" w:eastAsia="Wavehaus 42 Light" w:hAnsi="Wavehaus 42 Light" w:cs="Wavehaus 42 Light"/>
+                <w:sz w:val="20"/>
+              </w:rPr>
+              <w:t xml:space="preserve"> says why and how to activate it</w:t>
             </w:r>
           </w:p>
         </w:tc>
@@ -10245,7 +10273,7 @@
       <w:pPr>
         <w:pStyle w:val="Heading2"/>
       </w:pPr>
-      <w:bookmarkStart w:id="12" w:name="_Toc238982509"/>
+      <w:bookmarkStart w:id="12" w:name="_Toc238986139"/>
       <w:r>
         <w:rPr>
           <w:rFonts w:eastAsia="Wavehaus 128 Bold" w:cs="Wavehaus 128 Bold"/>
@@ -10259,7 +10287,7 @@
       <w:pPr>
         <w:pStyle w:val="Heading3"/>
       </w:pPr>
-      <w:bookmarkStart w:id="13" w:name="_Toc238982510"/>
+      <w:bookmarkStart w:id="13" w:name="_Toc238986140"/>
       <w:r>
         <w:rPr>
           <w:rFonts w:ascii="Wavehaus 128 Bold" w:eastAsia="Wavehaus 128 Bold" w:hAnsi="Wavehaus 128 Bold" w:cs="Wavehaus 128 Bold"/>
@@ -10714,7 +10742,7 @@
       <w:pPr>
         <w:pStyle w:val="Heading3"/>
       </w:pPr>
-      <w:bookmarkStart w:id="14" w:name="_Toc238982511"/>
+      <w:bookmarkStart w:id="14" w:name="_Toc238986141"/>
       <w:r>
         <w:rPr>
           <w:rFonts w:ascii="Wavehaus 128 Bold" w:eastAsia="Wavehaus 128 Bold" w:hAnsi="Wavehaus 128 Bold" w:cs="Wavehaus 128 Bold"/>
@@ -10864,7 +10892,7 @@
       <w:pPr>
         <w:pStyle w:val="Heading3"/>
       </w:pPr>
-      <w:bookmarkStart w:id="15" w:name="_Toc238982512"/>
+      <w:bookmarkStart w:id="15" w:name="_Toc238986142"/>
       <w:r>
         <w:rPr>
           <w:rFonts w:ascii="Wavehaus 128 Bold" w:eastAsia="Wavehaus 128 Bold" w:hAnsi="Wavehaus 128 Bold" w:cs="Wavehaus 128 Bold"/>
@@ -11409,7 +11437,7 @@
       <w:pPr>
         <w:pStyle w:val="Heading3"/>
       </w:pPr>
-      <w:bookmarkStart w:id="16" w:name="_Toc238982513"/>
+      <w:bookmarkStart w:id="16" w:name="_Toc238986143"/>
       <w:r>
         <w:rPr>
           <w:rFonts w:ascii="Wavehaus 128 Bold" w:eastAsia="Wavehaus 128 Bold" w:hAnsi="Wavehaus 128 Bold" w:cs="Wavehaus 128 Bold"/>
@@ -11716,7 +11744,7 @@
       <w:pPr>
         <w:pStyle w:val="Heading3"/>
       </w:pPr>
-      <w:bookmarkStart w:id="17" w:name="_Toc238982514"/>
+      <w:bookmarkStart w:id="17" w:name="_Toc238986144"/>
       <w:r>
         <w:rPr>
           <w:rFonts w:ascii="Wavehaus 128 Bold" w:eastAsia="Wavehaus 128 Bold" w:hAnsi="Wavehaus 128 Bold" w:cs="Wavehaus 128 Bold"/>
@@ -11851,7 +11879,7 @@
       <w:pPr>
         <w:pStyle w:val="Heading2"/>
       </w:pPr>
-      <w:bookmarkStart w:id="18" w:name="_Toc238982515"/>
+      <w:bookmarkStart w:id="18" w:name="_Toc238986145"/>
       <w:r>
         <w:rPr>
           <w:rFonts w:eastAsia="Wavehaus 128 Bold" w:cs="Wavehaus 128 Bold"/>
@@ -11865,7 +11893,7 @@
       <w:pPr>
         <w:pStyle w:val="Heading3"/>
       </w:pPr>
-      <w:bookmarkStart w:id="19" w:name="_Toc238982516"/>
+      <w:bookmarkStart w:id="19" w:name="_Toc238986146"/>
       <w:r>
         <w:rPr>
           <w:rFonts w:ascii="Wavehaus 128 Bold" w:eastAsia="Wavehaus 128 Bold" w:hAnsi="Wavehaus 128 Bold" w:cs="Wavehaus 128 Bold"/>
@@ -12045,7 +12073,7 @@
       <w:pPr>
         <w:pStyle w:val="Heading3"/>
       </w:pPr>
-      <w:bookmarkStart w:id="20" w:name="_Toc238982517"/>
+      <w:bookmarkStart w:id="20" w:name="_Toc238986147"/>
       <w:r>
         <w:rPr>
           <w:rFonts w:ascii="Wavehaus 128 Bold" w:eastAsia="Wavehaus 128 Bold" w:hAnsi="Wavehaus 128 Bold" w:cs="Wavehaus 128 Bold"/>
@@ -12792,7 +12820,7 @@
       <w:pPr>
         <w:pStyle w:val="Heading3"/>
       </w:pPr>
-      <w:bookmarkStart w:id="21" w:name="_Toc238982518"/>
+      <w:bookmarkStart w:id="21" w:name="_Toc238986148"/>
       <w:r>
         <w:rPr>
           <w:rFonts w:ascii="Wavehaus 128 Bold" w:eastAsia="Wavehaus 128 Bold" w:hAnsi="Wavehaus 128 Bold" w:cs="Wavehaus 128 Bold"/>
@@ -12934,7 +12962,7 @@
       <w:pPr>
         <w:pStyle w:val="Heading3"/>
       </w:pPr>
-      <w:bookmarkStart w:id="22" w:name="_Toc238982519"/>
+      <w:bookmarkStart w:id="22" w:name="_Toc238986149"/>
       <w:r>
         <w:rPr>
           <w:rFonts w:ascii="Wavehaus 128 Bold" w:eastAsia="Wavehaus 128 Bold" w:hAnsi="Wavehaus 128 Bold" w:cs="Wavehaus 128 Bold"/>
@@ -12999,7 +13027,7 @@
       <w:pPr>
         <w:pStyle w:val="Heading3"/>
       </w:pPr>
-      <w:bookmarkStart w:id="23" w:name="_Toc238982520"/>
+      <w:bookmarkStart w:id="23" w:name="_Toc238986150"/>
       <w:r>
         <w:rPr>
           <w:rFonts w:ascii="Wavehaus 128 Bold" w:eastAsia="Wavehaus 128 Bold" w:hAnsi="Wavehaus 128 Bold" w:cs="Wavehaus 128 Bold"/>
@@ -13317,7 +13345,7 @@
       <w:pPr>
         <w:pStyle w:val="Heading2"/>
       </w:pPr>
-      <w:bookmarkStart w:id="24" w:name="_Toc238982521"/>
+      <w:bookmarkStart w:id="24" w:name="_Toc238986151"/>
       <w:r>
         <w:rPr>
           <w:rFonts w:eastAsia="Wavehaus 128 Bold" w:cs="Wavehaus 128 Bold"/>
@@ -13357,7 +13385,7 @@
       <w:pPr>
         <w:pStyle w:val="Heading3"/>
       </w:pPr>
-      <w:bookmarkStart w:id="25" w:name="_Toc238982522"/>
+      <w:bookmarkStart w:id="25" w:name="_Toc238986152"/>
       <w:r>
         <w:rPr>
           <w:rFonts w:ascii="Wavehaus 128 Bold" w:eastAsia="Wavehaus 128 Bold" w:hAnsi="Wavehaus 128 Bold" w:cs="Wavehaus 128 Bold"/>
@@ -14063,7 +14091,7 @@
       <w:pPr>
         <w:pStyle w:val="Heading3"/>
       </w:pPr>
-      <w:bookmarkStart w:id="26" w:name="_Toc238982523"/>
+      <w:bookmarkStart w:id="26" w:name="_Toc238986153"/>
       <w:r>
         <w:rPr>
           <w:rFonts w:ascii="Wavehaus 128 Bold" w:eastAsia="Wavehaus 128 Bold" w:hAnsi="Wavehaus 128 Bold" w:cs="Wavehaus 128 Bold"/>
@@ -14675,7 +14703,7 @@
       <w:pPr>
         <w:pStyle w:val="Heading3"/>
       </w:pPr>
-      <w:bookmarkStart w:id="27" w:name="_Toc238982524"/>
+      <w:bookmarkStart w:id="27" w:name="_Toc238986154"/>
       <w:r>
         <w:rPr>
           <w:rFonts w:ascii="Wavehaus 128 Bold" w:eastAsia="Wavehaus 128 Bold" w:hAnsi="Wavehaus 128 Bold" w:cs="Wavehaus 128 Bold"/>
@@ -15610,7 +15638,7 @@
       <w:pPr>
         <w:pStyle w:val="Heading3"/>
       </w:pPr>
-      <w:bookmarkStart w:id="28" w:name="_Toc238982525"/>
+      <w:bookmarkStart w:id="28" w:name="_Toc238986155"/>
       <w:r>
         <w:rPr>
           <w:rFonts w:ascii="Wavehaus 128 Bold" w:eastAsia="Wavehaus 128 Bold" w:hAnsi="Wavehaus 128 Bold" w:cs="Wavehaus 128 Bold"/>
@@ -16035,7 +16063,7 @@
       <w:pPr>
         <w:pStyle w:val="Heading2"/>
       </w:pPr>
-      <w:bookmarkStart w:id="29" w:name="_Toc238982526"/>
+      <w:bookmarkStart w:id="29" w:name="_Toc238986156"/>
       <w:r>
         <w:rPr>
           <w:rFonts w:eastAsia="Wavehaus 128 Bold" w:cs="Wavehaus 128 Bold"/>
@@ -16049,7 +16077,7 @@
       <w:pPr>
         <w:pStyle w:val="Heading3"/>
       </w:pPr>
-      <w:bookmarkStart w:id="30" w:name="_Toc238982527"/>
+      <w:bookmarkStart w:id="30" w:name="_Toc238986157"/>
       <w:r>
         <w:rPr>
           <w:rFonts w:ascii="Wavehaus 128 Bold" w:eastAsia="Wavehaus 128 Bold" w:hAnsi="Wavehaus 128 Bold" w:cs="Wavehaus 128 Bold"/>
@@ -16415,7 +16443,7 @@
       <w:pPr>
         <w:pStyle w:val="Heading3"/>
       </w:pPr>
-      <w:bookmarkStart w:id="31" w:name="_Toc238982528"/>
+      <w:bookmarkStart w:id="31" w:name="_Toc238986158"/>
       <w:r>
         <w:rPr>
           <w:rFonts w:ascii="Wavehaus 128 Bold" w:eastAsia="Wavehaus 128 Bold" w:hAnsi="Wavehaus 128 Bold" w:cs="Wavehaus 128 Bold"/>
@@ -16518,7 +16546,7 @@
       <w:pPr>
         <w:pStyle w:val="Heading3"/>
       </w:pPr>
-      <w:bookmarkStart w:id="32" w:name="_Toc238982529"/>
+      <w:bookmarkStart w:id="32" w:name="_Toc238986159"/>
       <w:r>
         <w:rPr>
           <w:rFonts w:ascii="Wavehaus 128 Bold" w:eastAsia="Wavehaus 128 Bold" w:hAnsi="Wavehaus 128 Bold" w:cs="Wavehaus 128 Bold"/>
@@ -16590,7 +16618,7 @@
       <w:pPr>
         <w:pStyle w:val="Heading2"/>
       </w:pPr>
-      <w:bookmarkStart w:id="33" w:name="_Toc238982530"/>
+      <w:bookmarkStart w:id="33" w:name="_Toc238986160"/>
       <w:r>
         <w:rPr>
           <w:rFonts w:eastAsia="Wavehaus 128 Bold" w:cs="Wavehaus 128 Bold"/>
@@ -16672,7 +16700,7 @@
       <w:pPr>
         <w:pStyle w:val="Heading3"/>
       </w:pPr>
-      <w:bookmarkStart w:id="34" w:name="_Toc238982531"/>
+      <w:bookmarkStart w:id="34" w:name="_Toc238986161"/>
       <w:r>
         <w:rPr>
           <w:rFonts w:ascii="Wavehaus 128 Bold" w:eastAsia="Wavehaus 128 Bold" w:hAnsi="Wavehaus 128 Bold" w:cs="Wavehaus 128 Bold"/>
@@ -17131,7 +17159,7 @@
       <w:pPr>
         <w:pStyle w:val="Heading3"/>
       </w:pPr>
-      <w:bookmarkStart w:id="35" w:name="_Toc238982532"/>
+      <w:bookmarkStart w:id="35" w:name="_Toc238986162"/>
       <w:r>
         <w:rPr>
           <w:rFonts w:ascii="Wavehaus 128 Bold" w:eastAsia="Wavehaus 128 Bold" w:hAnsi="Wavehaus 128 Bold" w:cs="Wavehaus 128 Bold"/>
@@ -18173,7 +18201,7 @@
       <w:pPr>
         <w:pStyle w:val="Heading3"/>
       </w:pPr>
-      <w:bookmarkStart w:id="36" w:name="_Toc238982533"/>
+      <w:bookmarkStart w:id="36" w:name="_Toc238986163"/>
       <w:r>
         <w:rPr>
           <w:rFonts w:ascii="Wavehaus 128 Bold" w:eastAsia="Wavehaus 128 Bold" w:hAnsi="Wavehaus 128 Bold" w:cs="Wavehaus 128 Bold"/>
@@ -18526,7 +18554,7 @@
       <w:pPr>
         <w:pStyle w:val="Heading3"/>
       </w:pPr>
-      <w:bookmarkStart w:id="37" w:name="_Toc238982534"/>
+      <w:bookmarkStart w:id="37" w:name="_Toc238986164"/>
       <w:r>
         <w:rPr>
           <w:rFonts w:ascii="Wavehaus 128 Bold" w:eastAsia="Wavehaus 128 Bold" w:hAnsi="Wavehaus 128 Bold" w:cs="Wavehaus 128 Bold"/>
@@ -19485,7 +19513,7 @@
       <w:pPr>
         <w:pStyle w:val="Heading2"/>
       </w:pPr>
-      <w:bookmarkStart w:id="38" w:name="_Toc238982535"/>
+      <w:bookmarkStart w:id="38" w:name="_Toc238986165"/>
       <w:r>
         <w:rPr>
           <w:rFonts w:eastAsia="Wavehaus 128 Bold" w:cs="Wavehaus 128 Bold"/>
@@ -19553,7 +19581,7 @@
       <w:pPr>
         <w:pStyle w:val="Heading3"/>
       </w:pPr>
-      <w:bookmarkStart w:id="39" w:name="_Toc238982536"/>
+      <w:bookmarkStart w:id="39" w:name="_Toc238986166"/>
       <w:r>
         <w:rPr>
           <w:rFonts w:ascii="Wavehaus 128 Bold" w:eastAsia="Wavehaus 128 Bold" w:hAnsi="Wavehaus 128 Bold" w:cs="Wavehaus 128 Bold"/>
@@ -20252,7 +20280,7 @@
       <w:pPr>
         <w:pStyle w:val="Heading3"/>
       </w:pPr>
-      <w:bookmarkStart w:id="40" w:name="_Toc238982537"/>
+      <w:bookmarkStart w:id="40" w:name="_Toc238986167"/>
       <w:r>
         <w:rPr>
           <w:rFonts w:ascii="Wavehaus 128 Bold" w:eastAsia="Wavehaus 128 Bold" w:hAnsi="Wavehaus 128 Bold" w:cs="Wavehaus 128 Bold"/>
@@ -20498,7 +20526,7 @@
       <w:pPr>
         <w:pStyle w:val="Heading3"/>
       </w:pPr>
-      <w:bookmarkStart w:id="41" w:name="_Toc238982538"/>
+      <w:bookmarkStart w:id="41" w:name="_Toc238986168"/>
       <w:r>
         <w:rPr>
           <w:rFonts w:ascii="Wavehaus 128 Bold" w:eastAsia="Wavehaus 128 Bold" w:hAnsi="Wavehaus 128 Bold" w:cs="Wavehaus 128 Bold"/>
@@ -20897,7 +20925,7 @@
       <w:pPr>
         <w:pStyle w:val="Heading2"/>
       </w:pPr>
-      <w:bookmarkStart w:id="42" w:name="_Toc238982539"/>
+      <w:bookmarkStart w:id="42" w:name="_Toc238986169"/>
       <w:r>
         <w:rPr>
           <w:rFonts w:eastAsia="Wavehaus 128 Bold" w:cs="Wavehaus 128 Bold"/>
@@ -20937,7 +20965,7 @@
       <w:pPr>
         <w:pStyle w:val="Heading3"/>
       </w:pPr>
-      <w:bookmarkStart w:id="43" w:name="_Toc238982540"/>
+      <w:bookmarkStart w:id="43" w:name="_Toc238986170"/>
       <w:r>
         <w:rPr>
           <w:rFonts w:ascii="Wavehaus 128 Bold" w:eastAsia="Wavehaus 128 Bold" w:hAnsi="Wavehaus 128 Bold" w:cs="Wavehaus 128 Bold"/>
@@ -21415,7 +21443,7 @@
       <w:pPr>
         <w:pStyle w:val="Heading3"/>
       </w:pPr>
-      <w:bookmarkStart w:id="44" w:name="_Toc238982541"/>
+      <w:bookmarkStart w:id="44" w:name="_Toc238986171"/>
       <w:r>
         <w:rPr>
           <w:rFonts w:ascii="Wavehaus 128 Bold" w:eastAsia="Wavehaus 128 Bold" w:hAnsi="Wavehaus 128 Bold" w:cs="Wavehaus 128 Bold"/>
@@ -22339,7 +22367,7 @@
       <w:pPr>
         <w:pStyle w:val="Heading3"/>
       </w:pPr>
-      <w:bookmarkStart w:id="45" w:name="_Toc238982542"/>
+      <w:bookmarkStart w:id="45" w:name="_Toc238986172"/>
       <w:r>
         <w:rPr>
           <w:rFonts w:ascii="Wavehaus 128 Bold" w:eastAsia="Wavehaus 128 Bold" w:hAnsi="Wavehaus 128 Bold" w:cs="Wavehaus 128 Bold"/>
@@ -22407,7 +22435,7 @@
       <w:pPr>
         <w:pStyle w:val="Heading3"/>
       </w:pPr>
-      <w:bookmarkStart w:id="46" w:name="_Toc238982543"/>
+      <w:bookmarkStart w:id="46" w:name="_Toc238986173"/>
       <w:r>
         <w:rPr>
           <w:rFonts w:ascii="Wavehaus 128 Bold" w:eastAsia="Wavehaus 128 Bold" w:hAnsi="Wavehaus 128 Bold" w:cs="Wavehaus 128 Bold"/>
@@ -22543,7 +22571,7 @@
       <w:pPr>
         <w:pStyle w:val="Heading3"/>
       </w:pPr>
-      <w:bookmarkStart w:id="47" w:name="_Toc238982544"/>
+      <w:bookmarkStart w:id="47" w:name="_Toc238986174"/>
       <w:r>
         <w:rPr>
           <w:rFonts w:ascii="Wavehaus 128 Bold" w:eastAsia="Wavehaus 128 Bold" w:hAnsi="Wavehaus 128 Bold" w:cs="Wavehaus 128 Bold"/>
@@ -22659,7 +22687,7 @@
       <w:pPr>
         <w:pStyle w:val="Heading3"/>
       </w:pPr>
-      <w:bookmarkStart w:id="48" w:name="_Toc238982545"/>
+      <w:bookmarkStart w:id="48" w:name="_Toc238986175"/>
       <w:r>
         <w:rPr>
           <w:rFonts w:ascii="Wavehaus 128 Bold" w:eastAsia="Wavehaus 128 Bold" w:hAnsi="Wavehaus 128 Bold" w:cs="Wavehaus 128 Bold"/>
@@ -22713,7 +22741,7 @@
       <w:pPr>
         <w:pStyle w:val="Heading3"/>
       </w:pPr>
-      <w:bookmarkStart w:id="49" w:name="_Toc238982546"/>
+      <w:bookmarkStart w:id="49" w:name="_Toc238986176"/>
       <w:r>
         <w:rPr>
           <w:rFonts w:ascii="Wavehaus 128 Bold" w:eastAsia="Wavehaus 128 Bold" w:hAnsi="Wavehaus 128 Bold" w:cs="Wavehaus 128 Bold"/>
@@ -23039,7 +23067,7 @@
       <w:pPr>
         <w:pStyle w:val="Heading3"/>
       </w:pPr>
-      <w:bookmarkStart w:id="50" w:name="_Toc238982547"/>
+      <w:bookmarkStart w:id="50" w:name="_Toc238986177"/>
       <w:r>
         <w:rPr>
           <w:rFonts w:ascii="Wavehaus 128 Bold" w:eastAsia="Wavehaus 128 Bold" w:hAnsi="Wavehaus 128 Bold" w:cs="Wavehaus 128 Bold"/>
@@ -23079,7 +23107,7 @@
       <w:pPr>
         <w:pStyle w:val="Heading3"/>
       </w:pPr>
-      <w:bookmarkStart w:id="51" w:name="_Toc238982548"/>
+      <w:bookmarkStart w:id="51" w:name="_Toc238986178"/>
       <w:r>
         <w:rPr>
           <w:rFonts w:ascii="Wavehaus 128 Bold" w:eastAsia="Wavehaus 128 Bold" w:hAnsi="Wavehaus 128 Bold" w:cs="Wavehaus 128 Bold"/>
@@ -23179,7 +23207,7 @@
       <w:pPr>
         <w:pStyle w:val="Heading3"/>
       </w:pPr>
-      <w:bookmarkStart w:id="52" w:name="_Toc238982549"/>
+      <w:bookmarkStart w:id="52" w:name="_Toc238986179"/>
       <w:r>
         <w:rPr>
           <w:rFonts w:ascii="Wavehaus 128 Bold" w:eastAsia="Wavehaus 128 Bold" w:hAnsi="Wavehaus 128 Bold" w:cs="Wavehaus 128 Bold"/>
@@ -23541,7 +23569,7 @@
       <w:pPr>
         <w:pStyle w:val="Heading2"/>
       </w:pPr>
-      <w:bookmarkStart w:id="53" w:name="_Toc238982550"/>
+      <w:bookmarkStart w:id="53" w:name="_Toc238986180"/>
       <w:r>
         <w:rPr>
           <w:rFonts w:eastAsia="Wavehaus 128 Bold" w:cs="Wavehaus 128 Bold"/>
@@ -23581,7 +23609,7 @@
       <w:pPr>
         <w:pStyle w:val="Heading3"/>
       </w:pPr>
-      <w:bookmarkStart w:id="54" w:name="_Toc238982551"/>
+      <w:bookmarkStart w:id="54" w:name="_Toc238986181"/>
       <w:r>
         <w:rPr>
           <w:rFonts w:ascii="Wavehaus 128 Bold" w:eastAsia="Wavehaus 128 Bold" w:hAnsi="Wavehaus 128 Bold" w:cs="Wavehaus 128 Bold"/>
@@ -24006,7 +24034,7 @@
       <w:pPr>
         <w:pStyle w:val="Heading3"/>
       </w:pPr>
-      <w:bookmarkStart w:id="55" w:name="_Toc238982552"/>
+      <w:bookmarkStart w:id="55" w:name="_Toc238986182"/>
       <w:r>
         <w:rPr>
           <w:rFonts w:ascii="Wavehaus 128 Bold" w:eastAsia="Wavehaus 128 Bold" w:hAnsi="Wavehaus 128 Bold" w:cs="Wavehaus 128 Bold"/>
@@ -24032,7 +24060,7 @@
       <w:pPr>
         <w:pStyle w:val="Heading3"/>
       </w:pPr>
-      <w:bookmarkStart w:id="56" w:name="_Toc238982553"/>
+      <w:bookmarkStart w:id="56" w:name="_Toc238986183"/>
       <w:r>
         <w:rPr>
           <w:rFonts w:ascii="Wavehaus 128 Bold" w:eastAsia="Wavehaus 128 Bold" w:hAnsi="Wavehaus 128 Bold" w:cs="Wavehaus 128 Bold"/>
@@ -24653,7 +24681,7 @@
       <w:pPr>
         <w:pStyle w:val="Heading3"/>
       </w:pPr>
-      <w:bookmarkStart w:id="57" w:name="_Toc238982554"/>
+      <w:bookmarkStart w:id="57" w:name="_Toc238986184"/>
       <w:r>
         <w:rPr>
           <w:rFonts w:ascii="Wavehaus 128 Bold" w:eastAsia="Wavehaus 128 Bold" w:hAnsi="Wavehaus 128 Bold" w:cs="Wavehaus 128 Bold"/>
@@ -24928,7 +24956,7 @@
       <w:pPr>
         <w:pStyle w:val="Heading3"/>
       </w:pPr>
-      <w:bookmarkStart w:id="58" w:name="_Toc238982555"/>
+      <w:bookmarkStart w:id="58" w:name="_Toc238986185"/>
       <w:r>
         <w:rPr>
           <w:rFonts w:ascii="Wavehaus 128 Bold" w:eastAsia="Wavehaus 128 Bold" w:hAnsi="Wavehaus 128 Bold" w:cs="Wavehaus 128 Bold"/>
@@ -25159,7 +25187,7 @@
       <w:pPr>
         <w:pStyle w:val="Heading3"/>
       </w:pPr>
-      <w:bookmarkStart w:id="59" w:name="_Toc238982556"/>
+      <w:bookmarkStart w:id="59" w:name="_Toc238986186"/>
       <w:r>
         <w:rPr>
           <w:rFonts w:ascii="Wavehaus 128 Bold" w:eastAsia="Wavehaus 128 Bold" w:hAnsi="Wavehaus 128 Bold" w:cs="Wavehaus 128 Bold"/>
@@ -25331,7 +25359,7 @@
       <w:pPr>
         <w:pStyle w:val="Heading2"/>
       </w:pPr>
-      <w:bookmarkStart w:id="60" w:name="_Toc238982557"/>
+      <w:bookmarkStart w:id="60" w:name="_Toc238986187"/>
       <w:r>
         <w:rPr>
           <w:rFonts w:eastAsia="Wavehaus 128 Bold" w:cs="Wavehaus 128 Bold"/>
@@ -25357,7 +25385,7 @@
       <w:pPr>
         <w:pStyle w:val="Heading3"/>
       </w:pPr>
-      <w:bookmarkStart w:id="61" w:name="_Toc238982558"/>
+      <w:bookmarkStart w:id="61" w:name="_Toc238986188"/>
       <w:r>
         <w:rPr>
           <w:rFonts w:ascii="Wavehaus 128 Bold" w:eastAsia="Wavehaus 128 Bold" w:hAnsi="Wavehaus 128 Bold" w:cs="Wavehaus 128 Bold"/>
@@ -25464,7 +25492,7 @@
       <w:pPr>
         <w:pStyle w:val="Heading3"/>
       </w:pPr>
-      <w:bookmarkStart w:id="62" w:name="_Toc238982559"/>
+      <w:bookmarkStart w:id="62" w:name="_Toc238986189"/>
       <w:r>
         <w:rPr>
           <w:rFonts w:ascii="Wavehaus 128 Bold" w:eastAsia="Wavehaus 128 Bold" w:hAnsi="Wavehaus 128 Bold" w:cs="Wavehaus 128 Bold"/>
@@ -25518,7 +25546,7 @@
       <w:pPr>
         <w:pStyle w:val="Heading3"/>
       </w:pPr>
-      <w:bookmarkStart w:id="63" w:name="_Toc238982560"/>
+      <w:bookmarkStart w:id="63" w:name="_Toc238986190"/>
       <w:r>
         <w:rPr>
           <w:rFonts w:ascii="Wavehaus 128 Bold" w:eastAsia="Wavehaus 128 Bold" w:hAnsi="Wavehaus 128 Bold" w:cs="Wavehaus 128 Bold"/>
@@ -25729,7 +25757,7 @@
       <w:pPr>
         <w:pStyle w:val="Heading2"/>
       </w:pPr>
-      <w:bookmarkStart w:id="64" w:name="_Toc238982561"/>
+      <w:bookmarkStart w:id="64" w:name="_Toc238986191"/>
       <w:r>
         <w:rPr>
           <w:rFonts w:eastAsia="Wavehaus 128 Bold" w:cs="Wavehaus 128 Bold"/>
@@ -25755,7 +25783,7 @@
       <w:pPr>
         <w:pStyle w:val="Heading3"/>
       </w:pPr>
-      <w:bookmarkStart w:id="65" w:name="_Toc238982562"/>
+      <w:bookmarkStart w:id="65" w:name="_Toc238986192"/>
       <w:r>
         <w:rPr>
           <w:rFonts w:ascii="Wavehaus 128 Bold" w:eastAsia="Wavehaus 128 Bold" w:hAnsi="Wavehaus 128 Bold" w:cs="Wavehaus 128 Bold"/>
@@ -25879,7 +25907,7 @@
       <w:pPr>
         <w:pStyle w:val="Heading3"/>
       </w:pPr>
-      <w:bookmarkStart w:id="66" w:name="_Toc238982563"/>
+      <w:bookmarkStart w:id="66" w:name="_Toc238986193"/>
       <w:r>
         <w:rPr>
           <w:rFonts w:ascii="Wavehaus 128 Bold" w:eastAsia="Wavehaus 128 Bold" w:hAnsi="Wavehaus 128 Bold" w:cs="Wavehaus 128 Bold"/>
@@ -26100,7 +26128,7 @@
       <w:pPr>
         <w:pStyle w:val="Heading3"/>
       </w:pPr>
-      <w:bookmarkStart w:id="67" w:name="_Toc238982564"/>
+      <w:bookmarkStart w:id="67" w:name="_Toc238986194"/>
       <w:r>
         <w:rPr>
           <w:rFonts w:ascii="Wavehaus 128 Bold" w:eastAsia="Wavehaus 128 Bold" w:hAnsi="Wavehaus 128 Bold" w:cs="Wavehaus 128 Bold"/>
@@ -26532,7 +26560,7 @@
       <w:pPr>
         <w:pStyle w:val="Heading3"/>
       </w:pPr>
-      <w:bookmarkStart w:id="68" w:name="_Toc238982565"/>
+      <w:bookmarkStart w:id="68" w:name="_Toc238986195"/>
       <w:r>
         <w:rPr>
           <w:rFonts w:ascii="Wavehaus 128 Bold" w:eastAsia="Wavehaus 128 Bold" w:hAnsi="Wavehaus 128 Bold" w:cs="Wavehaus 128 Bold"/>
@@ -26700,7 +26728,7 @@
           <w:rFonts w:ascii="Consolas" w:eastAsia="Consolas" w:hAnsi="Consolas" w:cs="Consolas"/>
           <w:sz w:val="20"/>
         </w:rPr>
-        <w:t>.github/workflows/desktop-release.yml</w:t>
+        <w:t>desktop/ci/desktop-release.yml</w:t>
       </w:r>
       <w:r>
         <w:rPr>
@@ -26768,9 +26796,91 @@
     </w:p>
     <w:p>
       <w:pPr>
+        <w:spacing w:line="360" w:lineRule="auto"/>
+      </w:pPr>
+      <w:r>
+        <w:rPr>
+          <w:rFonts w:ascii="Wavehaus 42 Light" w:eastAsia="Wavehaus 42 Light" w:hAnsi="Wavehaus 42 Light" w:cs="Wavehaus 42 Light"/>
+          <w:sz w:val="24"/>
+        </w:rPr>
+        <w:t xml:space="preserve">The workflow currently sits in </w:t>
+      </w:r>
+      <w:r>
+        <w:rPr>
+          <w:rFonts w:ascii="Consolas" w:eastAsia="Consolas" w:hAnsi="Consolas" w:cs="Consolas"/>
+          <w:sz w:val="20"/>
+        </w:rPr>
+        <w:t>desktop/ci/</w:t>
+      </w:r>
+      <w:r>
+        <w:rPr>
+          <w:rFonts w:ascii="Wavehaus 42 Light" w:eastAsia="Wavehaus 42 Light" w:hAnsi="Wavehaus 42 Light" w:cs="Wavehaus 42 Light"/>
+          <w:sz w:val="24"/>
+        </w:rPr>
+        <w:t xml:space="preserve"> rather than </w:t>
+      </w:r>
+      <w:r>
+        <w:rPr>
+          <w:rFonts w:ascii="Consolas" w:eastAsia="Consolas" w:hAnsi="Consolas" w:cs="Consolas"/>
+          <w:sz w:val="20"/>
+        </w:rPr>
+        <w:t>.github/workflows/</w:t>
+      </w:r>
+      <w:r>
+        <w:rPr>
+          <w:rFonts w:ascii="Wavehaus 42 Light" w:eastAsia="Wavehaus 42 Light" w:hAnsi="Wavehaus 42 Light" w:cs="Wavehaus 42 Light"/>
+          <w:sz w:val="24"/>
+        </w:rPr>
+        <w:t xml:space="preserve">, so it is committed but not yet live. GitHub refuses a push from an OAuth app that creates or updates anything under </w:t>
+      </w:r>
+      <w:r>
+        <w:rPr>
+          <w:rFonts w:ascii="Consolas" w:eastAsia="Consolas" w:hAnsi="Consolas" w:cs="Consolas"/>
+          <w:sz w:val="20"/>
+        </w:rPr>
+        <w:t>.github/workflows/</w:t>
+      </w:r>
+      <w:r>
+        <w:rPr>
+          <w:rFonts w:ascii="Wavehaus 42 Light" w:eastAsia="Wavehaus 42 Light" w:hAnsi="Wavehaus 42 Light" w:cs="Wavehaus 42 Light"/>
+          <w:sz w:val="24"/>
+        </w:rPr>
+        <w:t xml:space="preserve"> unless the token carries the </w:t>
+      </w:r>
+      <w:r>
+        <w:rPr>
+          <w:rFonts w:ascii="Consolas" w:eastAsia="Consolas" w:hAnsi="Consolas" w:cs="Consolas"/>
+          <w:sz w:val="20"/>
+        </w:rPr>
+        <w:t>workflow</w:t>
+      </w:r>
+      <w:r>
+        <w:rPr>
+          <w:rFonts w:ascii="Wavehaus 42 Light" w:eastAsia="Wavehaus 42 Light" w:hAnsi="Wavehaus 42 Light" w:cs="Wavehaus 42 Light"/>
+          <w:sz w:val="24"/>
+        </w:rPr>
+        <w:t xml:space="preserve"> scope, and the token this repository pushes with does not. </w:t>
+      </w:r>
+      <w:r>
+        <w:rPr>
+          <w:rFonts w:ascii="Consolas" w:eastAsia="Consolas" w:hAnsi="Consolas" w:cs="Consolas"/>
+          <w:sz w:val="20"/>
+        </w:rPr>
+        <w:t>desktop/ci/README.md</w:t>
+      </w:r>
+      <w:r>
+        <w:rPr>
+          <w:rFonts w:ascii="Wavehaus 42 Light" w:eastAsia="Wavehaus 42 Light" w:hAnsi="Wavehaus 42 Light" w:cs="Wavehaus 42 Light"/>
+          <w:sz w:val="24"/>
+        </w:rPr>
+        <w:t xml:space="preserve"> carries the two commands that put it in place - one to grant the scope, one to move the file.</w:t>
+      </w:r>
+    </w:p>
+    <w:p>
+      <w:pPr>
         <w:pStyle w:val="Heading3"/>
       </w:pPr>
-      <w:bookmarkStart w:id="69" w:name="_Toc238982566"/>
+      <w:bookmarkStart w:id="69" w:name="_Toc238986196"/>
       <w:r>
         <w:rPr>
           <w:rFonts w:ascii="Wavehaus 128 Bold" w:eastAsia="Wavehaus 128 Bold" w:hAnsi="Wavehaus 128 Bold" w:cs="Wavehaus 128 Bold"/>
@@ -26954,7 +27064,7 @@
       <w:pPr>
         <w:pStyle w:val="Heading3"/>
       </w:pPr>
-      <w:bookmarkStart w:id="70" w:name="_Toc238982567"/>
+      <w:bookmarkStart w:id="70" w:name="_Toc238986197"/>
       <w:r>
         <w:rPr>
           <w:rFonts w:ascii="Wavehaus 128 Bold" w:eastAsia="Wavehaus 128 Bold" w:hAnsi="Wavehaus 128 Bold" w:cs="Wavehaus 128 Bold"/>
@@ -27440,7 +27550,7 @@
       <w:pPr>
         <w:pStyle w:val="Heading2"/>
       </w:pPr>
-      <w:bookmarkStart w:id="71" w:name="_Toc238982568"/>
+      <w:bookmarkStart w:id="71" w:name="_Toc238986198"/>
       <w:r>
         <w:rPr>
           <w:rFonts w:eastAsia="Wavehaus 128 Bold" w:cs="Wavehaus 128 Bold"/>
@@ -27527,7 +27637,7 @@
       <w:pPr>
         <w:pStyle w:val="Heading3"/>
       </w:pPr>
-      <w:bookmarkStart w:id="72" w:name="_Toc238982569"/>
+      <w:bookmarkStart w:id="72" w:name="_Toc238986199"/>
       <w:r>
         <w:rPr>
           <w:rFonts w:ascii="Wavehaus 128 Bold" w:eastAsia="Wavehaus 128 Bold" w:hAnsi="Wavehaus 128 Bold" w:cs="Wavehaus 128 Bold"/>
@@ -27963,7 +28073,7 @@
       <w:pPr>
         <w:pStyle w:val="Heading3"/>
       </w:pPr>
-      <w:bookmarkStart w:id="73" w:name="_Toc238982570"/>
+      <w:bookmarkStart w:id="73" w:name="_Toc238986200"/>
       <w:r>
         <w:rPr>
           <w:rFonts w:ascii="Wavehaus 128 Bold" w:eastAsia="Wavehaus 128 Bold" w:hAnsi="Wavehaus 128 Bold" w:cs="Wavehaus 128 Bold"/>
@@ -28085,7 +28195,7 @@
       <w:pPr>
         <w:pStyle w:val="Heading2"/>
       </w:pPr>
-      <w:bookmarkStart w:id="74" w:name="_Toc238982571"/>
+      <w:bookmarkStart w:id="74" w:name="_Toc238986201"/>
       <w:r>
         <w:rPr>
           <w:rFonts w:eastAsia="Wavehaus 128 Bold" w:cs="Wavehaus 128 Bold"/>
@@ -28099,7 +28209,7 @@
       <w:pPr>
         <w:pStyle w:val="Heading3"/>
       </w:pPr>
-      <w:bookmarkStart w:id="75" w:name="_Toc238982572"/>
+      <w:bookmarkStart w:id="75" w:name="_Toc238986202"/>
       <w:r>
         <w:rPr>
           <w:rFonts w:ascii="Wavehaus 128 Bold" w:eastAsia="Wavehaus 128 Bold" w:hAnsi="Wavehaus 128 Bold" w:cs="Wavehaus 128 Bold"/>
@@ -28312,7 +28422,7 @@
       <w:pPr>
         <w:pStyle w:val="Heading3"/>
       </w:pPr>
-      <w:bookmarkStart w:id="76" w:name="_Toc238982573"/>
+      <w:bookmarkStart w:id="76" w:name="_Toc238986203"/>
       <w:r>
         <w:rPr>
           <w:rFonts w:ascii="Wavehaus 128 Bold" w:eastAsia="Wavehaus 128 Bold" w:hAnsi="Wavehaus 128 Bold" w:cs="Wavehaus 128 Bold"/>
@@ -29184,7 +29294,7 @@
       <w:pPr>
         <w:pStyle w:val="Heading2"/>
       </w:pPr>
-      <w:bookmarkStart w:id="77" w:name="_Toc238982574"/>
+      <w:bookmarkStart w:id="77" w:name="_Toc238986204"/>
       <w:r>
         <w:rPr>
           <w:rFonts w:eastAsia="Wavehaus 128 Bold" w:cs="Wavehaus 128 Bold"/>
@@ -29210,7 +29320,7 @@
       <w:pPr>
         <w:pStyle w:val="Heading3"/>
       </w:pPr>
-      <w:bookmarkStart w:id="78" w:name="_Toc238982575"/>
+      <w:bookmarkStart w:id="78" w:name="_Toc238986205"/>
       <w:r>
         <w:rPr>
           <w:rFonts w:ascii="Wavehaus 128 Bold" w:eastAsia="Wavehaus 128 Bold" w:hAnsi="Wavehaus 128 Bold" w:cs="Wavehaus 128 Bold"/>
@@ -29603,7 +29713,7 @@
       <w:pPr>
         <w:pStyle w:val="Heading3"/>
       </w:pPr>
-      <w:bookmarkStart w:id="79" w:name="_Toc238982576"/>
+      <w:bookmarkStart w:id="79" w:name="_Toc238986206"/>
       <w:r>
         <w:rPr>
           <w:rFonts w:ascii="Wavehaus 128 Bold" w:eastAsia="Wavehaus 128 Bold" w:hAnsi="Wavehaus 128 Bold" w:cs="Wavehaus 128 Bold"/>
@@ -29751,7 +29861,7 @@
       <w:pPr>
         <w:pStyle w:val="Heading3"/>
       </w:pPr>
-      <w:bookmarkStart w:id="80" w:name="_Toc238982577"/>
+      <w:bookmarkStart w:id="80" w:name="_Toc238986207"/>
       <w:r>
         <w:rPr>
           <w:rFonts w:ascii="Wavehaus 128 Bold" w:eastAsia="Wavehaus 128 Bold" w:hAnsi="Wavehaus 128 Bold" w:cs="Wavehaus 128 Bold"/>
@@ -29969,7 +30079,7 @@
       <w:pPr>
         <w:pStyle w:val="Heading2"/>
       </w:pPr>
-      <w:bookmarkStart w:id="81" w:name="_Toc238982578"/>
+      <w:bookmarkStart w:id="81" w:name="_Toc238986208"/>
       <w:r>
         <w:rPr>
           <w:rFonts w:eastAsia="Wavehaus 128 Bold" w:cs="Wavehaus 128 Bold"/>

</xml_diff>